<commit_message>
fix(dbms): lab 2 keep CREATE DATABASE alone so pgAdmin runs it outside a transaction
Co-Authored-By: Devin AI <158243242+devin-ai-integration[bot]@users.noreply.github.com>
</commit_message>
<xml_diff>
--- a/DBMS/solution/lab2/report.docx
+++ b/DBMS/solution/lab2/report.docx
@@ -614,6 +614,42 @@
           <w:rFonts w:ascii="Courier New" w:hAnsi="Courier New"/>
           <w:sz w:val="18"/>
         </w:rPr>
+        <w:t>-- В файле только одна команда: pgAdmin выполняет несколько команд одной транзакцией,</w:t>
+      </w:r>
+    </w:p>
+    <w:p>
+      <w:pPr>
+        <w:spacing w:after="0" w:line="240" w:lineRule="auto"/>
+      </w:pPr>
+      <w:r>
+        <w:rPr>
+          <w:rFonts w:ascii="Courier New" w:hAnsi="Courier New"/>
+          <w:sz w:val="18"/>
+        </w:rPr>
+        <w:t>-- а CREATE DATABASE внутри транзакции запрещён (SQLSTATE 25001). Комментарий к базе</w:t>
+      </w:r>
+    </w:p>
+    <w:p>
+      <w:pPr>
+        <w:spacing w:after="0" w:line="240" w:lineRule="auto"/>
+      </w:pPr>
+      <w:r>
+        <w:rPr>
+          <w:rFonts w:ascii="Courier New" w:hAnsi="Courier New"/>
+          <w:sz w:val="18"/>
+        </w:rPr>
+        <w:t>-- задаётся в начале 02_create_tables.sql.</w:t>
+      </w:r>
+    </w:p>
+    <w:p>
+      <w:pPr>
+        <w:spacing w:after="0" w:line="240" w:lineRule="auto"/>
+      </w:pPr>
+      <w:r>
+        <w:rPr>
+          <w:rFonts w:ascii="Courier New" w:hAnsi="Courier New"/>
+          <w:sz w:val="18"/>
+        </w:rPr>
         <w:t>-- Образец: пособие, ЛР 2, стр. 69.</w:t>
       </w:r>
     </w:p>
@@ -787,14 +823,21 @@
     </w:p>
     <w:p>
       <w:pPr>
-        <w:spacing w:after="0" w:line="240" w:lineRule="auto"/>
+        <w:spacing w:after="0" w:line="360" w:lineRule="auto"/>
+        <w:ind w:firstLine="709"/>
+      </w:pPr>
+    </w:p>
+    <w:p>
+      <w:pPr>
+        <w:spacing w:after="0" w:line="360" w:lineRule="auto"/>
+        <w:ind w:firstLine="709"/>
       </w:pPr>
       <w:r>
         <w:rPr>
-          <w:rFonts w:ascii="Courier New" w:hAnsi="Courier New"/>
-          <w:sz w:val="18"/>
+          <w:b w:val="0"/>
+          <w:sz w:val="28"/>
         </w:rPr>
-        <w:t xml:space="preserve"> </w:t>
+        <w:t>В файле 01_create_database.sql одна команда: pgAdmin выполняет несколько команд одной транзакцией, а CREATE DATABASE внутри транзакции запрещён (ошибка SQLSTATE 25001). Поэтому комментарий к базе задаётся в начале файла 02_create_tables.sql:</w:t>
       </w:r>
     </w:p>
     <w:p>

</xml_diff>

<commit_message>
refactor(dbms): lab 2 remove comments from SQL scripts
Co-Authored-By: Devin AI <158243242+devin-ai-integration[bot]@users.noreply.github.com>
</commit_message>
<xml_diff>
--- a/DBMS/solution/lab2/report.docx
+++ b/DBMS/solution/lab2/report.docx
@@ -579,138 +579,6 @@
           <w:sz w:val="28"/>
         </w:rPr>
         <w:t>База данных formula1 создаётся инструкцией CREATE DATABASE по образцу пособия (с. 69): владелец postgres, кодировка UTF8, табличное пространство pg_default, без ограничения числа подключений. Скрипт выполняется в Query Tool при подключении к базе postgres (файл 01_create_database.sql).</w:t>
-      </w:r>
-    </w:p>
-    <w:p>
-      <w:pPr>
-        <w:spacing w:after="0" w:line="240" w:lineRule="auto"/>
-      </w:pPr>
-      <w:r>
-        <w:rPr>
-          <w:rFonts w:ascii="Courier New" w:hAnsi="Courier New"/>
-          <w:sz w:val="18"/>
-        </w:rPr>
-        <w:t>-- ЛР 2. Создание новой базы данных formula1</w:t>
-      </w:r>
-    </w:p>
-    <w:p>
-      <w:pPr>
-        <w:spacing w:after="0" w:line="240" w:lineRule="auto"/>
-      </w:pPr>
-      <w:r>
-        <w:rPr>
-          <w:rFonts w:ascii="Courier New" w:hAnsi="Courier New"/>
-          <w:sz w:val="18"/>
-        </w:rPr>
-        <w:t>-- Выполнять, подключившись к базе postgres (pgAdmin: Query Tool на базе postgres).</w:t>
-      </w:r>
-    </w:p>
-    <w:p>
-      <w:pPr>
-        <w:spacing w:after="0" w:line="240" w:lineRule="auto"/>
-      </w:pPr>
-      <w:r>
-        <w:rPr>
-          <w:rFonts w:ascii="Courier New" w:hAnsi="Courier New"/>
-          <w:sz w:val="18"/>
-        </w:rPr>
-        <w:t>-- В файле только одна команда: pgAdmin выполняет несколько команд одной транзакцией,</w:t>
-      </w:r>
-    </w:p>
-    <w:p>
-      <w:pPr>
-        <w:spacing w:after="0" w:line="240" w:lineRule="auto"/>
-      </w:pPr>
-      <w:r>
-        <w:rPr>
-          <w:rFonts w:ascii="Courier New" w:hAnsi="Courier New"/>
-          <w:sz w:val="18"/>
-        </w:rPr>
-        <w:t>-- а CREATE DATABASE внутри транзакции запрещён (SQLSTATE 25001). Комментарий к базе</w:t>
-      </w:r>
-    </w:p>
-    <w:p>
-      <w:pPr>
-        <w:spacing w:after="0" w:line="240" w:lineRule="auto"/>
-      </w:pPr>
-      <w:r>
-        <w:rPr>
-          <w:rFonts w:ascii="Courier New" w:hAnsi="Courier New"/>
-          <w:sz w:val="18"/>
-        </w:rPr>
-        <w:t>-- задаётся в начале 02_create_tables.sql.</w:t>
-      </w:r>
-    </w:p>
-    <w:p>
-      <w:pPr>
-        <w:spacing w:after="0" w:line="240" w:lineRule="auto"/>
-      </w:pPr>
-      <w:r>
-        <w:rPr>
-          <w:rFonts w:ascii="Courier New" w:hAnsi="Courier New"/>
-          <w:sz w:val="18"/>
-        </w:rPr>
-        <w:t>-- Образец: пособие, ЛР 2, стр. 69.</w:t>
-      </w:r>
-    </w:p>
-    <w:p>
-      <w:pPr>
-        <w:spacing w:after="0" w:line="240" w:lineRule="auto"/>
-      </w:pPr>
-      <w:r>
-        <w:rPr>
-          <w:rFonts w:ascii="Courier New" w:hAnsi="Courier New"/>
-          <w:sz w:val="18"/>
-        </w:rPr>
-        <w:t xml:space="preserve"> </w:t>
-      </w:r>
-    </w:p>
-    <w:p>
-      <w:pPr>
-        <w:spacing w:after="0" w:line="240" w:lineRule="auto"/>
-      </w:pPr>
-      <w:r>
-        <w:rPr>
-          <w:rFonts w:ascii="Courier New" w:hAnsi="Courier New"/>
-          <w:sz w:val="18"/>
-        </w:rPr>
-        <w:t>-- Database: formula1</w:t>
-      </w:r>
-    </w:p>
-    <w:p>
-      <w:pPr>
-        <w:spacing w:after="0" w:line="240" w:lineRule="auto"/>
-      </w:pPr>
-      <w:r>
-        <w:rPr>
-          <w:rFonts w:ascii="Courier New" w:hAnsi="Courier New"/>
-          <w:sz w:val="18"/>
-        </w:rPr>
-        <w:t xml:space="preserve"> </w:t>
-      </w:r>
-    </w:p>
-    <w:p>
-      <w:pPr>
-        <w:spacing w:after="0" w:line="240" w:lineRule="auto"/>
-      </w:pPr>
-      <w:r>
-        <w:rPr>
-          <w:rFonts w:ascii="Courier New" w:hAnsi="Courier New"/>
-          <w:sz w:val="18"/>
-        </w:rPr>
-        <w:t>-- DROP DATABASE IF EXISTS formula1;</w:t>
-      </w:r>
-    </w:p>
-    <w:p>
-      <w:pPr>
-        <w:spacing w:after="0" w:line="240" w:lineRule="auto"/>
-      </w:pPr>
-      <w:r>
-        <w:rPr>
-          <w:rFonts w:ascii="Courier New" w:hAnsi="Courier New"/>
-          <w:sz w:val="18"/>
-        </w:rPr>
-        <w:t xml:space="preserve"> </w:t>
       </w:r>
     </w:p>
     <w:p>
@@ -3169,42 +3037,6 @@
           <w:rFonts w:ascii="Courier New" w:hAnsi="Courier New"/>
           <w:sz w:val="18"/>
         </w:rPr>
-        <w:t>-------------------------------------------</w:t>
-      </w:r>
-    </w:p>
-    <w:p>
-      <w:pPr>
-        <w:spacing w:after="0" w:line="240" w:lineRule="auto"/>
-      </w:pPr>
-      <w:r>
-        <w:rPr>
-          <w:rFonts w:ascii="Courier New" w:hAnsi="Courier New"/>
-          <w:sz w:val="18"/>
-        </w:rPr>
-        <w:t>-- Создание таблицы teams (Команды)</w:t>
-      </w:r>
-    </w:p>
-    <w:p>
-      <w:pPr>
-        <w:spacing w:after="0" w:line="240" w:lineRule="auto"/>
-      </w:pPr>
-      <w:r>
-        <w:rPr>
-          <w:rFonts w:ascii="Courier New" w:hAnsi="Courier New"/>
-          <w:sz w:val="18"/>
-        </w:rPr>
-        <w:t>-------------------------------------------</w:t>
-      </w:r>
-    </w:p>
-    <w:p>
-      <w:pPr>
-        <w:spacing w:after="0" w:line="240" w:lineRule="auto"/>
-      </w:pPr>
-      <w:r>
-        <w:rPr>
-          <w:rFonts w:ascii="Courier New" w:hAnsi="Courier New"/>
-          <w:sz w:val="18"/>
-        </w:rPr>
         <w:t>CREATE TABLE teams (</w:t>
       </w:r>
     </w:p>
@@ -3289,42 +3121,6 @@
           <w:rFonts w:ascii="Courier New" w:hAnsi="Courier New"/>
           <w:sz w:val="18"/>
         </w:rPr>
-        <w:t>-------------------------------------------</w:t>
-      </w:r>
-    </w:p>
-    <w:p>
-      <w:pPr>
-        <w:spacing w:after="0" w:line="240" w:lineRule="auto"/>
-      </w:pPr>
-      <w:r>
-        <w:rPr>
-          <w:rFonts w:ascii="Courier New" w:hAnsi="Courier New"/>
-          <w:sz w:val="18"/>
-        </w:rPr>
-        <w:t>-- Создание таблицы cars (Болиды)</w:t>
-      </w:r>
-    </w:p>
-    <w:p>
-      <w:pPr>
-        <w:spacing w:after="0" w:line="240" w:lineRule="auto"/>
-      </w:pPr>
-      <w:r>
-        <w:rPr>
-          <w:rFonts w:ascii="Courier New" w:hAnsi="Courier New"/>
-          <w:sz w:val="18"/>
-        </w:rPr>
-        <w:t>-------------------------------------------</w:t>
-      </w:r>
-    </w:p>
-    <w:p>
-      <w:pPr>
-        <w:spacing w:after="0" w:line="240" w:lineRule="auto"/>
-      </w:pPr>
-      <w:r>
-        <w:rPr>
-          <w:rFonts w:ascii="Courier New" w:hAnsi="Courier New"/>
-          <w:sz w:val="18"/>
-        </w:rPr>
         <w:t>CREATE TABLE cars (</w:t>
       </w:r>
     </w:p>
@@ -3421,42 +3217,6 @@
           <w:rFonts w:ascii="Courier New" w:hAnsi="Courier New"/>
           <w:sz w:val="18"/>
         </w:rPr>
-        <w:t>-------------------------------------------</w:t>
-      </w:r>
-    </w:p>
-    <w:p>
-      <w:pPr>
-        <w:spacing w:after="0" w:line="240" w:lineRule="auto"/>
-      </w:pPr>
-      <w:r>
-        <w:rPr>
-          <w:rFonts w:ascii="Courier New" w:hAnsi="Courier New"/>
-          <w:sz w:val="18"/>
-        </w:rPr>
-        <w:t>-- Создание таблицы drivers (Пилоты)</w:t>
-      </w:r>
-    </w:p>
-    <w:p>
-      <w:pPr>
-        <w:spacing w:after="0" w:line="240" w:lineRule="auto"/>
-      </w:pPr>
-      <w:r>
-        <w:rPr>
-          <w:rFonts w:ascii="Courier New" w:hAnsi="Courier New"/>
-          <w:sz w:val="18"/>
-        </w:rPr>
-        <w:t>-------------------------------------------</w:t>
-      </w:r>
-    </w:p>
-    <w:p>
-      <w:pPr>
-        <w:spacing w:after="0" w:line="240" w:lineRule="auto"/>
-      </w:pPr>
-      <w:r>
-        <w:rPr>
-          <w:rFonts w:ascii="Courier New" w:hAnsi="Courier New"/>
-          <w:sz w:val="18"/>
-        </w:rPr>
         <w:t>CREATE TABLE drivers (</w:t>
       </w:r>
     </w:p>
@@ -3553,66 +3313,6 @@
           <w:rFonts w:ascii="Courier New" w:hAnsi="Courier New"/>
           <w:sz w:val="18"/>
         </w:rPr>
-        <w:t>-------------------------------------------</w:t>
-      </w:r>
-    </w:p>
-    <w:p>
-      <w:pPr>
-        <w:spacing w:after="0" w:line="240" w:lineRule="auto"/>
-      </w:pPr>
-      <w:r>
-        <w:rPr>
-          <w:rFonts w:ascii="Courier New" w:hAnsi="Courier New"/>
-          <w:sz w:val="18"/>
-        </w:rPr>
-        <w:t>-- Создание таблицы parts (Запчасти)</w:t>
-      </w:r>
-    </w:p>
-    <w:p>
-      <w:pPr>
-        <w:spacing w:after="0" w:line="240" w:lineRule="auto"/>
-      </w:pPr>
-      <w:r>
-        <w:rPr>
-          <w:rFonts w:ascii="Courier New" w:hAnsi="Courier New"/>
-          <w:sz w:val="18"/>
-        </w:rPr>
-        <w:t>-- Зависимая сущность: идентифицирующая связь с cars,</w:t>
-      </w:r>
-    </w:p>
-    <w:p>
-      <w:pPr>
-        <w:spacing w:after="0" w:line="240" w:lineRule="auto"/>
-      </w:pPr>
-      <w:r>
-        <w:rPr>
-          <w:rFonts w:ascii="Courier New" w:hAnsi="Courier New"/>
-          <w:sz w:val="18"/>
-        </w:rPr>
-        <w:t>-- поэтому car_ID входит в составной первичный ключ.</w:t>
-      </w:r>
-    </w:p>
-    <w:p>
-      <w:pPr>
-        <w:spacing w:after="0" w:line="240" w:lineRule="auto"/>
-      </w:pPr>
-      <w:r>
-        <w:rPr>
-          <w:rFonts w:ascii="Courier New" w:hAnsi="Courier New"/>
-          <w:sz w:val="18"/>
-        </w:rPr>
-        <w:t>-------------------------------------------</w:t>
-      </w:r>
-    </w:p>
-    <w:p>
-      <w:pPr>
-        <w:spacing w:after="0" w:line="240" w:lineRule="auto"/>
-      </w:pPr>
-      <w:r>
-        <w:rPr>
-          <w:rFonts w:ascii="Courier New" w:hAnsi="Courier New"/>
-          <w:sz w:val="18"/>
-        </w:rPr>
         <w:t>CREATE TABLE parts (</w:t>
       </w:r>
     </w:p>
@@ -3709,42 +3409,6 @@
           <w:rFonts w:ascii="Courier New" w:hAnsi="Courier New"/>
           <w:sz w:val="18"/>
         </w:rPr>
-        <w:t>-------------------------------------------</w:t>
-      </w:r>
-    </w:p>
-    <w:p>
-      <w:pPr>
-        <w:spacing w:after="0" w:line="240" w:lineRule="auto"/>
-      </w:pPr>
-      <w:r>
-        <w:rPr>
-          <w:rFonts w:ascii="Courier New" w:hAnsi="Courier New"/>
-          <w:sz w:val="18"/>
-        </w:rPr>
-        <w:t>-- Создание таблицы sponsors (Спонсоры)</w:t>
-      </w:r>
-    </w:p>
-    <w:p>
-      <w:pPr>
-        <w:spacing w:after="0" w:line="240" w:lineRule="auto"/>
-      </w:pPr>
-      <w:r>
-        <w:rPr>
-          <w:rFonts w:ascii="Courier New" w:hAnsi="Courier New"/>
-          <w:sz w:val="18"/>
-        </w:rPr>
-        <w:t>-------------------------------------------</w:t>
-      </w:r>
-    </w:p>
-    <w:p>
-      <w:pPr>
-        <w:spacing w:after="0" w:line="240" w:lineRule="auto"/>
-      </w:pPr>
-      <w:r>
-        <w:rPr>
-          <w:rFonts w:ascii="Courier New" w:hAnsi="Courier New"/>
-          <w:sz w:val="18"/>
-        </w:rPr>
         <w:t>CREATE TABLE sponsors (</w:t>
       </w:r>
     </w:p>
@@ -3829,42 +3493,6 @@
           <w:rFonts w:ascii="Courier New" w:hAnsi="Courier New"/>
           <w:sz w:val="18"/>
         </w:rPr>
-        <w:t>-------------------------------------------</w:t>
-      </w:r>
-    </w:p>
-    <w:p>
-      <w:pPr>
-        <w:spacing w:after="0" w:line="240" w:lineRule="auto"/>
-      </w:pPr>
-      <w:r>
-        <w:rPr>
-          <w:rFonts w:ascii="Courier New" w:hAnsi="Courier New"/>
-          <w:sz w:val="18"/>
-        </w:rPr>
-        <w:t>-- Создание таблицы tracks (Трассы)</w:t>
-      </w:r>
-    </w:p>
-    <w:p>
-      <w:pPr>
-        <w:spacing w:after="0" w:line="240" w:lineRule="auto"/>
-      </w:pPr>
-      <w:r>
-        <w:rPr>
-          <w:rFonts w:ascii="Courier New" w:hAnsi="Courier New"/>
-          <w:sz w:val="18"/>
-        </w:rPr>
-        <w:t>-------------------------------------------</w:t>
-      </w:r>
-    </w:p>
-    <w:p>
-      <w:pPr>
-        <w:spacing w:after="0" w:line="240" w:lineRule="auto"/>
-      </w:pPr>
-      <w:r>
-        <w:rPr>
-          <w:rFonts w:ascii="Courier New" w:hAnsi="Courier New"/>
-          <w:sz w:val="18"/>
-        </w:rPr>
         <w:t>CREATE TABLE tracks (</w:t>
       </w:r>
     </w:p>
@@ -3950,42 +3578,6 @@
           <w:sz w:val="18"/>
         </w:rPr>
         <w:t xml:space="preserve"> </w:t>
-      </w:r>
-    </w:p>
-    <w:p>
-      <w:pPr>
-        <w:spacing w:after="0" w:line="240" w:lineRule="auto"/>
-      </w:pPr>
-      <w:r>
-        <w:rPr>
-          <w:rFonts w:ascii="Courier New" w:hAnsi="Courier New"/>
-          <w:sz w:val="18"/>
-        </w:rPr>
-        <w:t>-------------------------------------------</w:t>
-      </w:r>
-    </w:p>
-    <w:p>
-      <w:pPr>
-        <w:spacing w:after="0" w:line="240" w:lineRule="auto"/>
-      </w:pPr>
-      <w:r>
-        <w:rPr>
-          <w:rFonts w:ascii="Courier New" w:hAnsi="Courier New"/>
-          <w:sz w:val="18"/>
-        </w:rPr>
-        <w:t>-- Создание таблицы races (Гонки)</w:t>
-      </w:r>
-    </w:p>
-    <w:p>
-      <w:pPr>
-        <w:spacing w:after="0" w:line="240" w:lineRule="auto"/>
-      </w:pPr>
-      <w:r>
-        <w:rPr>
-          <w:rFonts w:ascii="Courier New" w:hAnsi="Courier New"/>
-          <w:sz w:val="18"/>
-        </w:rPr>
-        <w:t>-------------------------------------------</w:t>
       </w:r>
     </w:p>
     <w:p>
@@ -4659,42 +4251,6 @@
           <w:rFonts w:ascii="Courier New" w:hAnsi="Courier New"/>
           <w:sz w:val="18"/>
         </w:rPr>
-        <w:t>-------------------------------------------</w:t>
-      </w:r>
-    </w:p>
-    <w:p>
-      <w:pPr>
-        <w:spacing w:after="0" w:line="240" w:lineRule="auto"/>
-      </w:pPr>
-      <w:r>
-        <w:rPr>
-          <w:rFonts w:ascii="Courier New" w:hAnsi="Courier New"/>
-          <w:sz w:val="18"/>
-        </w:rPr>
-        <w:t>-- Определение внешних ключей</w:t>
-      </w:r>
-    </w:p>
-    <w:p>
-      <w:pPr>
-        <w:spacing w:after="0" w:line="240" w:lineRule="auto"/>
-      </w:pPr>
-      <w:r>
-        <w:rPr>
-          <w:rFonts w:ascii="Courier New" w:hAnsi="Courier New"/>
-          <w:sz w:val="18"/>
-        </w:rPr>
-        <w:t>-------------------------------------------</w:t>
-      </w:r>
-    </w:p>
-    <w:p>
-      <w:pPr>
-        <w:spacing w:after="0" w:line="240" w:lineRule="auto"/>
-      </w:pPr>
-      <w:r>
-        <w:rPr>
-          <w:rFonts w:ascii="Courier New" w:hAnsi="Courier New"/>
-          <w:sz w:val="18"/>
-        </w:rPr>
         <w:t>ALTER TABLE cars</w:t>
       </w:r>
     </w:p>
@@ -5055,42 +4611,6 @@
           <w:rFonts w:ascii="Courier New" w:hAnsi="Courier New"/>
           <w:sz w:val="18"/>
         </w:rPr>
-        <w:t>-------------------------------------------</w:t>
-      </w:r>
-    </w:p>
-    <w:p>
-      <w:pPr>
-        <w:spacing w:after="0" w:line="240" w:lineRule="auto"/>
-      </w:pPr>
-      <w:r>
-        <w:rPr>
-          <w:rFonts w:ascii="Courier New" w:hAnsi="Courier New"/>
-          <w:sz w:val="18"/>
-        </w:rPr>
-        <w:t>-- Ограничения уникальности (потенциальные ключи)</w:t>
-      </w:r>
-    </w:p>
-    <w:p>
-      <w:pPr>
-        <w:spacing w:after="0" w:line="240" w:lineRule="auto"/>
-      </w:pPr>
-      <w:r>
-        <w:rPr>
-          <w:rFonts w:ascii="Courier New" w:hAnsi="Courier New"/>
-          <w:sz w:val="18"/>
-        </w:rPr>
-        <w:t>-------------------------------------------</w:t>
-      </w:r>
-    </w:p>
-    <w:p>
-      <w:pPr>
-        <w:spacing w:after="0" w:line="240" w:lineRule="auto"/>
-      </w:pPr>
-      <w:r>
-        <w:rPr>
-          <w:rFonts w:ascii="Courier New" w:hAnsi="Courier New"/>
-          <w:sz w:val="18"/>
-        </w:rPr>
         <w:t>ALTER TABLE teams ADD CONSTRAINT teams_name_UQ UNIQUE (name);</w:t>
       </w:r>
     </w:p>
@@ -5128,42 +4648,6 @@
           <w:sz w:val="18"/>
         </w:rPr>
         <w:t xml:space="preserve"> </w:t>
-      </w:r>
-    </w:p>
-    <w:p>
-      <w:pPr>
-        <w:spacing w:after="0" w:line="240" w:lineRule="auto"/>
-      </w:pPr>
-      <w:r>
-        <w:rPr>
-          <w:rFonts w:ascii="Courier New" w:hAnsi="Courier New"/>
-          <w:sz w:val="18"/>
-        </w:rPr>
-        <w:t>-------------------------------------------</w:t>
-      </w:r>
-    </w:p>
-    <w:p>
-      <w:pPr>
-        <w:spacing w:after="0" w:line="240" w:lineRule="auto"/>
-      </w:pPr>
-      <w:r>
-        <w:rPr>
-          <w:rFonts w:ascii="Courier New" w:hAnsi="Courier New"/>
-          <w:sz w:val="18"/>
-        </w:rPr>
-        <w:t>-- Ограничения проверки</w:t>
-      </w:r>
-    </w:p>
-    <w:p>
-      <w:pPr>
-        <w:spacing w:after="0" w:line="240" w:lineRule="auto"/>
-      </w:pPr>
-      <w:r>
-        <w:rPr>
-          <w:rFonts w:ascii="Courier New" w:hAnsi="Courier New"/>
-          <w:sz w:val="18"/>
-        </w:rPr>
-        <w:t>-------------------------------------------</w:t>
       </w:r>
     </w:p>
     <w:p>
@@ -5725,66 +5209,6 @@
       </w:tr>
     </w:tbl>
     <w:p/>
-    <w:p>
-      <w:pPr>
-        <w:spacing w:after="0" w:line="240" w:lineRule="auto"/>
-      </w:pPr>
-      <w:r>
-        <w:rPr>
-          <w:rFonts w:ascii="Courier New" w:hAnsi="Courier New"/>
-          <w:sz w:val="18"/>
-        </w:rPr>
-        <w:t>-------------------------------------------</w:t>
-      </w:r>
-    </w:p>
-    <w:p>
-      <w:pPr>
-        <w:spacing w:after="0" w:line="240" w:lineRule="auto"/>
-      </w:pPr>
-      <w:r>
-        <w:rPr>
-          <w:rFonts w:ascii="Courier New" w:hAnsi="Courier New"/>
-          <w:sz w:val="18"/>
-        </w:rPr>
-        <w:t>-- Индексы на внешние ключи</w:t>
-      </w:r>
-    </w:p>
-    <w:p>
-      <w:pPr>
-        <w:spacing w:after="0" w:line="240" w:lineRule="auto"/>
-      </w:pPr>
-      <w:r>
-        <w:rPr>
-          <w:rFonts w:ascii="Courier New" w:hAnsi="Courier New"/>
-          <w:sz w:val="18"/>
-        </w:rPr>
-        <w:t>-- PRIMARY KEY и UNIQUE создают индексы автоматически (стр. 72),</w:t>
-      </w:r>
-    </w:p>
-    <w:p>
-      <w:pPr>
-        <w:spacing w:after="0" w:line="240" w:lineRule="auto"/>
-      </w:pPr>
-      <w:r>
-        <w:rPr>
-          <w:rFonts w:ascii="Courier New" w:hAnsi="Courier New"/>
-          <w:sz w:val="18"/>
-        </w:rPr>
-        <w:t>-- FOREIGN KEY — нет (стр. 73). parts.car_ID уже покрыт индексом parts_PK.</w:t>
-      </w:r>
-    </w:p>
-    <w:p>
-      <w:pPr>
-        <w:spacing w:after="0" w:line="240" w:lineRule="auto"/>
-      </w:pPr>
-      <w:r>
-        <w:rPr>
-          <w:rFonts w:ascii="Courier New" w:hAnsi="Courier New"/>
-          <w:sz w:val="18"/>
-        </w:rPr>
-        <w:t>-------------------------------------------</w:t>
-      </w:r>
-    </w:p>
     <w:p>
       <w:pPr>
         <w:spacing w:after="0" w:line="240" w:lineRule="auto"/>

</xml_diff>

<commit_message>
fix(dbms): lab 2 accept restrict_violation in RESTRICT checks
Co-Authored-By: Devin AI <158243242+devin-ai-integration[bot]@users.noreply.github.com>
</commit_message>
<xml_diff>
--- a/DBMS/solution/lab2/report.docx
+++ b/DBMS/solution/lab2/report.docx
@@ -5635,7 +5635,7 @@
               <w:rPr>
                 <w:sz w:val="22"/>
               </w:rPr>
-              <w:t>foreign_key_violation (races_FK1, RESTRICT)</w:t>
+              <w:t>foreign_key_violation или restrict_violation (races_FK1, RESTRICT)</w:t>
             </w:r>
           </w:p>
         </w:tc>
@@ -5665,7 +5665,7 @@
               <w:rPr>
                 <w:sz w:val="22"/>
               </w:rPr>
-              <w:t>foreign_key_violation (races_FK2, RESTRICT)</w:t>
+              <w:t>foreign_key_violation или restrict_violation (races_FK2, RESTRICT)</w:t>
             </w:r>
           </w:p>
         </w:tc>

</xml_diff>

<commit_message>
feat(dbms): lab 2 split parts into catalog and car_parts junction table
Co-Authored-By: Devin AI <158243242+devin-ai-integration[bot]@users.noreply.github.com>
</commit_message>
<xml_diff>
--- a/DBMS/solution/lab2/report.docx
+++ b/DBMS/solution/lab2/report.docx
@@ -551,7 +551,7 @@
           <w:b w:val="0"/>
           <w:sz w:val="28"/>
         </w:rPr>
-        <w:t>Предметная область — чемпионат «Формула-1». Модель данных (ЛР 1) содержит семь сущностей: Команды, Болиды, Пилоты, Запчасти, Спонсоры, Трассы и Гонки. Команда имеет много болидов и пилотов, болид — много запчастей (запчасть — зависимая сущность, идентифицирующая связь), на трассе и при участии спонсора проводится много гонок.</w:t>
+        <w:t>Предметная область — чемпионат «Формула-1». Модель данных (ЛР 1) содержит сущности Команды, Болиды, Пилоты, Запчасти, Спонсоры, Трассы и Гонки. Команда имеет много болидов и пилотов, на трассе и при участии спонсора проводится много гонок. Болид и запчасть связаны отношением «многие-ко-многим»: в болиде много запчастей, а одна запчасть из справочника может стоять в нескольких болидах. Такая связь реализуется отдельной таблицей car_parts (Запчасти болидов), которая хранит пары «болид — запчасть».</w:t>
       </w:r>
     </w:p>
     <w:p>
@@ -829,7 +829,7 @@
           <w:b w:val="0"/>
           <w:sz w:val="28"/>
         </w:rPr>
-        <w:t>По физической модели из ЛР 1 созданы семь таблиц. Как рекомендует пособие (с. 76), в инструкциях CREATE TABLE заданы только ограничения NOT NULL и PRIMARY KEY, остальные ограничения добавляются отдельными инструкциями ALTER TABLE (файл 02_create_tables.sql). Структура таблиц приведена в таблицах 1–7.</w:t>
+        <w:t>По физической модели из ЛР 1 созданы восемь таблиц: семь сущностей и связующая таблица car_parts. Как рекомендует пособие (с. 76), в инструкциях CREATE TABLE заданы только ограничения NOT NULL и PRIMARY KEY, остальные ограничения добавляются отдельными инструкциями ALTER TABLE (файл 02_create_tables.sql). Структура таблиц приведена в таблицах 1–8.</w:t>
       </w:r>
     </w:p>
     <w:p>
@@ -1839,64 +1839,6 @@
               <w:rPr>
                 <w:sz w:val="22"/>
               </w:rPr>
-              <w:t>car_ID</w:t>
-            </w:r>
-          </w:p>
-        </w:tc>
-        <w:tc>
-          <w:tcPr>
-            <w:tcW w:type="dxa" w:w="1814"/>
-          </w:tcPr>
-          <w:p>
-            <w:r/>
-            <w:r>
-              <w:rPr>
-                <w:sz w:val="22"/>
-              </w:rPr>
-              <w:t>integer</w:t>
-            </w:r>
-          </w:p>
-        </w:tc>
-        <w:tc>
-          <w:tcPr>
-            <w:tcW w:type="dxa" w:w="2835"/>
-          </w:tcPr>
-          <w:p>
-            <w:r/>
-            <w:r>
-              <w:rPr>
-                <w:sz w:val="22"/>
-              </w:rPr>
-              <w:t>PK, FK → cars, NOT NULL</w:t>
-            </w:r>
-          </w:p>
-        </w:tc>
-        <w:tc>
-          <w:tcPr>
-            <w:tcW w:type="dxa" w:w="3005"/>
-          </w:tcPr>
-          <w:p>
-            <w:r/>
-            <w:r>
-              <w:rPr>
-                <w:sz w:val="22"/>
-              </w:rPr>
-              <w:t>Болид</w:t>
-            </w:r>
-          </w:p>
-        </w:tc>
-      </w:tr>
-      <w:tr>
-        <w:tc>
-          <w:tcPr>
-            <w:tcW w:type="dxa" w:w="1701"/>
-          </w:tcPr>
-          <w:p>
-            <w:r/>
-            <w:r>
-              <w:rPr>
-                <w:sz w:val="22"/>
-              </w:rPr>
               <w:t>part_ID</w:t>
             </w:r>
           </w:p>
@@ -1939,7 +1881,7 @@
               <w:rPr>
                 <w:sz w:val="22"/>
               </w:rPr>
-              <w:t>Номер запчасти в болиде</w:t>
+              <w:t>Идентификатор запчасти</w:t>
             </w:r>
           </w:p>
         </w:tc>
@@ -2072,7 +2014,213 @@
           <w:b w:val="0"/>
           <w:sz w:val="24"/>
         </w:rPr>
-        <w:t>Таблица 5 — sponsors (Спонсоры)</w:t>
+        <w:t>Таблица 5 — car_parts (Запчасти болидов)</w:t>
+      </w:r>
+    </w:p>
+    <w:tbl>
+      <w:tblPr>
+        <w:tblStyle w:val="TableGrid"/>
+        <w:tblW w:type="auto" w:w="0"/>
+        <w:jc w:val="center"/>
+        <w:tblLook w:firstColumn="1" w:firstRow="1" w:lastColumn="0" w:lastRow="0" w:noHBand="0" w:noVBand="1" w:val="04A0"/>
+      </w:tblPr>
+      <w:tblGrid>
+        <w:gridCol w:w="2339"/>
+        <w:gridCol w:w="2339"/>
+        <w:gridCol w:w="2339"/>
+        <w:gridCol w:w="2339"/>
+      </w:tblGrid>
+      <w:tr>
+        <w:tc>
+          <w:tcPr>
+            <w:tcW w:type="dxa" w:w="1701"/>
+          </w:tcPr>
+          <w:p>
+            <w:r/>
+            <w:r>
+              <w:rPr>
+                <w:b/>
+                <w:sz w:val="22"/>
+              </w:rPr>
+              <w:t>Поле</w:t>
+            </w:r>
+          </w:p>
+        </w:tc>
+        <w:tc>
+          <w:tcPr>
+            <w:tcW w:type="dxa" w:w="1814"/>
+          </w:tcPr>
+          <w:p>
+            <w:r/>
+            <w:r>
+              <w:rPr>
+                <w:b/>
+                <w:sz w:val="22"/>
+              </w:rPr>
+              <w:t>Тип</w:t>
+            </w:r>
+          </w:p>
+        </w:tc>
+        <w:tc>
+          <w:tcPr>
+            <w:tcW w:type="dxa" w:w="2835"/>
+          </w:tcPr>
+          <w:p>
+            <w:r/>
+            <w:r>
+              <w:rPr>
+                <w:b/>
+                <w:sz w:val="22"/>
+              </w:rPr>
+              <w:t>Ограничения</w:t>
+            </w:r>
+          </w:p>
+        </w:tc>
+        <w:tc>
+          <w:tcPr>
+            <w:tcW w:type="dxa" w:w="3005"/>
+          </w:tcPr>
+          <w:p>
+            <w:r/>
+            <w:r>
+              <w:rPr>
+                <w:b/>
+                <w:sz w:val="22"/>
+              </w:rPr>
+              <w:t>Описание</w:t>
+            </w:r>
+          </w:p>
+        </w:tc>
+      </w:tr>
+      <w:tr>
+        <w:tc>
+          <w:tcPr>
+            <w:tcW w:type="dxa" w:w="1701"/>
+          </w:tcPr>
+          <w:p>
+            <w:r/>
+            <w:r>
+              <w:rPr>
+                <w:sz w:val="22"/>
+              </w:rPr>
+              <w:t>car_ID</w:t>
+            </w:r>
+          </w:p>
+        </w:tc>
+        <w:tc>
+          <w:tcPr>
+            <w:tcW w:type="dxa" w:w="1814"/>
+          </w:tcPr>
+          <w:p>
+            <w:r/>
+            <w:r>
+              <w:rPr>
+                <w:sz w:val="22"/>
+              </w:rPr>
+              <w:t>integer</w:t>
+            </w:r>
+          </w:p>
+        </w:tc>
+        <w:tc>
+          <w:tcPr>
+            <w:tcW w:type="dxa" w:w="2835"/>
+          </w:tcPr>
+          <w:p>
+            <w:r/>
+            <w:r>
+              <w:rPr>
+                <w:sz w:val="22"/>
+              </w:rPr>
+              <w:t>PK, FK → cars, NOT NULL</w:t>
+            </w:r>
+          </w:p>
+        </w:tc>
+        <w:tc>
+          <w:tcPr>
+            <w:tcW w:type="dxa" w:w="3005"/>
+          </w:tcPr>
+          <w:p>
+            <w:r/>
+            <w:r>
+              <w:rPr>
+                <w:sz w:val="22"/>
+              </w:rPr>
+              <w:t>Болид</w:t>
+            </w:r>
+          </w:p>
+        </w:tc>
+      </w:tr>
+      <w:tr>
+        <w:tc>
+          <w:tcPr>
+            <w:tcW w:type="dxa" w:w="1701"/>
+          </w:tcPr>
+          <w:p>
+            <w:r/>
+            <w:r>
+              <w:rPr>
+                <w:sz w:val="22"/>
+              </w:rPr>
+              <w:t>part_ID</w:t>
+            </w:r>
+          </w:p>
+        </w:tc>
+        <w:tc>
+          <w:tcPr>
+            <w:tcW w:type="dxa" w:w="1814"/>
+          </w:tcPr>
+          <w:p>
+            <w:r/>
+            <w:r>
+              <w:rPr>
+                <w:sz w:val="22"/>
+              </w:rPr>
+              <w:t>integer</w:t>
+            </w:r>
+          </w:p>
+        </w:tc>
+        <w:tc>
+          <w:tcPr>
+            <w:tcW w:type="dxa" w:w="2835"/>
+          </w:tcPr>
+          <w:p>
+            <w:r/>
+            <w:r>
+              <w:rPr>
+                <w:sz w:val="22"/>
+              </w:rPr>
+              <w:t>PK, FK → parts, NOT NULL</w:t>
+            </w:r>
+          </w:p>
+        </w:tc>
+        <w:tc>
+          <w:tcPr>
+            <w:tcW w:type="dxa" w:w="3005"/>
+          </w:tcPr>
+          <w:p>
+            <w:r/>
+            <w:r>
+              <w:rPr>
+                <w:sz w:val="22"/>
+              </w:rPr>
+              <w:t>Запчасть, установленная в болид</w:t>
+            </w:r>
+          </w:p>
+        </w:tc>
+      </w:tr>
+    </w:tbl>
+    <w:p/>
+    <w:p>
+      <w:pPr>
+        <w:spacing w:after="0" w:line="240" w:lineRule="auto"/>
+        <w:ind w:firstLine="0"/>
+      </w:pPr>
+      <w:r>
+        <w:rPr>
+          <w:b w:val="0"/>
+          <w:sz w:val="24"/>
+        </w:rPr>
+        <w:t>Таблица 6 — sponsors (Спонсоры)</w:t>
       </w:r>
     </w:p>
     <w:tbl>
@@ -2336,7 +2484,7 @@
           <w:b w:val="0"/>
           <w:sz w:val="24"/>
         </w:rPr>
-        <w:t>Таблица 6 — tracks (Трассы)</w:t>
+        <w:t>Таблица 7 — tracks (Трассы)</w:t>
       </w:r>
     </w:p>
     <w:tbl>
@@ -2658,7 +2806,7 @@
           <w:b w:val="0"/>
           <w:sz w:val="24"/>
         </w:rPr>
-        <w:t>Таблица 7 — races (Гонки)</w:t>
+        <w:t>Таблица 8 — races (Гонки)</w:t>
       </w:r>
     </w:p>
     <w:tbl>
@@ -3325,6 +3473,90 @@
           <w:rFonts w:ascii="Courier New" w:hAnsi="Courier New"/>
           <w:sz w:val="18"/>
         </w:rPr>
+        <w:t xml:space="preserve">    part_ID integer NOT NULL,</w:t>
+      </w:r>
+    </w:p>
+    <w:p>
+      <w:pPr>
+        <w:spacing w:after="0" w:line="240" w:lineRule="auto"/>
+      </w:pPr>
+      <w:r>
+        <w:rPr>
+          <w:rFonts w:ascii="Courier New" w:hAnsi="Courier New"/>
+          <w:sz w:val="18"/>
+        </w:rPr>
+        <w:t xml:space="preserve">    name varchar(100) NOT NULL,</w:t>
+      </w:r>
+    </w:p>
+    <w:p>
+      <w:pPr>
+        <w:spacing w:after="0" w:line="240" w:lineRule="auto"/>
+      </w:pPr>
+      <w:r>
+        <w:rPr>
+          <w:rFonts w:ascii="Courier New" w:hAnsi="Courier New"/>
+          <w:sz w:val="18"/>
+        </w:rPr>
+        <w:t xml:space="preserve">    type varchar(50) NOT NULL,</w:t>
+      </w:r>
+    </w:p>
+    <w:p>
+      <w:pPr>
+        <w:spacing w:after="0" w:line="240" w:lineRule="auto"/>
+      </w:pPr>
+      <w:r>
+        <w:rPr>
+          <w:rFonts w:ascii="Courier New" w:hAnsi="Courier New"/>
+          <w:sz w:val="18"/>
+        </w:rPr>
+        <w:t xml:space="preserve">    CONSTRAINT parts_PK PRIMARY KEY (part_ID)</w:t>
+      </w:r>
+    </w:p>
+    <w:p>
+      <w:pPr>
+        <w:spacing w:after="0" w:line="240" w:lineRule="auto"/>
+      </w:pPr>
+      <w:r>
+        <w:rPr>
+          <w:rFonts w:ascii="Courier New" w:hAnsi="Courier New"/>
+          <w:sz w:val="18"/>
+        </w:rPr>
+        <w:t>);</w:t>
+      </w:r>
+    </w:p>
+    <w:p>
+      <w:pPr>
+        <w:spacing w:after="0" w:line="240" w:lineRule="auto"/>
+      </w:pPr>
+      <w:r>
+        <w:rPr>
+          <w:rFonts w:ascii="Courier New" w:hAnsi="Courier New"/>
+          <w:sz w:val="18"/>
+        </w:rPr>
+        <w:t xml:space="preserve"> </w:t>
+      </w:r>
+    </w:p>
+    <w:p>
+      <w:pPr>
+        <w:spacing w:after="0" w:line="240" w:lineRule="auto"/>
+      </w:pPr>
+      <w:r>
+        <w:rPr>
+          <w:rFonts w:ascii="Courier New" w:hAnsi="Courier New"/>
+          <w:sz w:val="18"/>
+        </w:rPr>
+        <w:t>CREATE TABLE car_parts (</w:t>
+      </w:r>
+    </w:p>
+    <w:p>
+      <w:pPr>
+        <w:spacing w:after="0" w:line="240" w:lineRule="auto"/>
+      </w:pPr>
+      <w:r>
+        <w:rPr>
+          <w:rFonts w:ascii="Courier New" w:hAnsi="Courier New"/>
+          <w:sz w:val="18"/>
+        </w:rPr>
         <w:t xml:space="preserve">    car_ID integer NOT NULL,</w:t>
       </w:r>
     </w:p>
@@ -3349,31 +3581,7 @@
           <w:rFonts w:ascii="Courier New" w:hAnsi="Courier New"/>
           <w:sz w:val="18"/>
         </w:rPr>
-        <w:t xml:space="preserve">    name varchar(100) NOT NULL,</w:t>
-      </w:r>
-    </w:p>
-    <w:p>
-      <w:pPr>
-        <w:spacing w:after="0" w:line="240" w:lineRule="auto"/>
-      </w:pPr>
-      <w:r>
-        <w:rPr>
-          <w:rFonts w:ascii="Courier New" w:hAnsi="Courier New"/>
-          <w:sz w:val="18"/>
-        </w:rPr>
-        <w:t xml:space="preserve">    type varchar(50) NOT NULL,</w:t>
-      </w:r>
-    </w:p>
-    <w:p>
-      <w:pPr>
-        <w:spacing w:after="0" w:line="240" w:lineRule="auto"/>
-      </w:pPr>
-      <w:r>
-        <w:rPr>
-          <w:rFonts w:ascii="Courier New" w:hAnsi="Courier New"/>
-          <w:sz w:val="18"/>
-        </w:rPr>
-        <w:t xml:space="preserve">    CONSTRAINT parts_PK PRIMARY KEY (car_ID, part_ID)</w:t>
+        <w:t xml:space="preserve">    CONSTRAINT car_parts_PK PRIMARY KEY (car_ID, part_ID)</w:t>
       </w:r>
     </w:p>
     <w:p>
@@ -3760,7 +3968,7 @@
           <w:b w:val="0"/>
           <w:sz w:val="28"/>
         </w:rPr>
-        <w:t>Связи «один-ко-многим» из модели ЛР 1 реализованы внешними ключами (таблица 8). Для данных, принадлежащих команде и болиду, выбрано каскадное удаление и обновление, как в образце пособия (с. 79): при удалении команды удаляются её болиды и пилоты, при удалении болида — его запчасти. Трассу и спонсора, у которых есть гонки, удалить нельзя (RESTRICT), чтобы не потерять результаты гонок; изменение их ключа распространяется каскадно.</w:t>
+        <w:t>Связи «один-ко-многим» из модели ЛР 1 реализованы внешними ключами (таблица 9); связь «многие-ко-многим» болидов и запчастей разложена на две связи «один-ко-многим» через таблицу car_parts. Для данных, принадлежащих команде и болиду, выбрано каскадное удаление и обновление, как в образце пособия (с. 79): при удалении команды удаляются её болиды и пилоты, при удалении болида — привязки запчастей к нему (сама запчасть остаётся в справочнике parts). Запчасть, установленную хотя бы в один болид, удалить нельзя (RESTRICT). Трассу и спонсора, у которых есть гонки, удалить нельзя (RESTRICT), чтобы не потерять результаты гонок; изменение их ключа распространяется каскадно.</w:t>
       </w:r>
     </w:p>
     <w:p>
@@ -3773,7 +3981,7 @@
           <w:b w:val="0"/>
           <w:sz w:val="24"/>
         </w:rPr>
-        <w:t>Таблица 8 — Внешние ключи</w:t>
+        <w:t>Таблица 9 — Внешние ключи</w:t>
       </w:r>
     </w:p>
     <w:tbl>
@@ -4022,7 +4230,7 @@
               <w:rPr>
                 <w:sz w:val="22"/>
               </w:rPr>
-              <w:t>parts_FK</w:t>
+              <w:t>car_parts_FK1</w:t>
             </w:r>
           </w:p>
         </w:tc>
@@ -4036,7 +4244,7 @@
               <w:rPr>
                 <w:sz w:val="22"/>
               </w:rPr>
-              <w:t>parts.car_ID → cars.car_ID</w:t>
+              <w:t>car_parts.car_ID → cars.car_ID</w:t>
             </w:r>
           </w:p>
         </w:tc>
@@ -4065,6 +4273,78 @@
                 <w:sz w:val="22"/>
               </w:rPr>
               <w:t>CASCADE</w:t>
+            </w:r>
+          </w:p>
+        </w:tc>
+        <w:tc>
+          <w:tcPr>
+            <w:tcW w:type="dxa" w:w="1247"/>
+          </w:tcPr>
+          <w:p>
+            <w:r/>
+            <w:r>
+              <w:rPr>
+                <w:sz w:val="22"/>
+              </w:rPr>
+              <w:t>CASCADE</w:t>
+            </w:r>
+          </w:p>
+        </w:tc>
+      </w:tr>
+      <w:tr>
+        <w:tc>
+          <w:tcPr>
+            <w:tcW w:type="dxa" w:w="1587"/>
+          </w:tcPr>
+          <w:p>
+            <w:r/>
+            <w:r>
+              <w:rPr>
+                <w:sz w:val="22"/>
+              </w:rPr>
+              <w:t>car_parts_FK2</w:t>
+            </w:r>
+          </w:p>
+        </w:tc>
+        <w:tc>
+          <w:tcPr>
+            <w:tcW w:type="dxa" w:w="3402"/>
+          </w:tcPr>
+          <w:p>
+            <w:r/>
+            <w:r>
+              <w:rPr>
+                <w:sz w:val="22"/>
+              </w:rPr>
+              <w:t>car_parts.part_ID → parts.part_ID</w:t>
+            </w:r>
+          </w:p>
+        </w:tc>
+        <w:tc>
+          <w:tcPr>
+            <w:tcW w:type="dxa" w:w="1814"/>
+          </w:tcPr>
+          <w:p>
+            <w:r/>
+            <w:r>
+              <w:rPr>
+                <w:sz w:val="22"/>
+              </w:rPr>
+              <w:t>1:N, идентифицирующая</w:t>
+            </w:r>
+          </w:p>
+        </w:tc>
+        <w:tc>
+          <w:tcPr>
+            <w:tcW w:type="dxa" w:w="1304"/>
+          </w:tcPr>
+          <w:p>
+            <w:r/>
+            <w:r>
+              <w:rPr>
+                <w:sz w:val="22"/>
+              </w:rPr>
+              <w:t>RESTRICT</w:t>
             </w:r>
           </w:p>
         </w:tc>
@@ -4395,7 +4675,7 @@
           <w:rFonts w:ascii="Courier New" w:hAnsi="Courier New"/>
           <w:sz w:val="18"/>
         </w:rPr>
-        <w:t>ALTER TABLE parts</w:t>
+        <w:t>ALTER TABLE car_parts</w:t>
       </w:r>
     </w:p>
     <w:p>
@@ -4407,7 +4687,7 @@
           <w:rFonts w:ascii="Courier New" w:hAnsi="Courier New"/>
           <w:sz w:val="18"/>
         </w:rPr>
-        <w:t>ADD CONSTRAINT parts_FK FOREIGN KEY (car_ID)</w:t>
+        <w:t>ADD CONSTRAINT car_parts_FK1 FOREIGN KEY (car_ID)</w:t>
       </w:r>
     </w:p>
     <w:p>
@@ -4432,6 +4712,78 @@
           <w:sz w:val="18"/>
         </w:rPr>
         <w:t>ON DELETE CASCADE</w:t>
+      </w:r>
+    </w:p>
+    <w:p>
+      <w:pPr>
+        <w:spacing w:after="0" w:line="240" w:lineRule="auto"/>
+      </w:pPr>
+      <w:r>
+        <w:rPr>
+          <w:rFonts w:ascii="Courier New" w:hAnsi="Courier New"/>
+          <w:sz w:val="18"/>
+        </w:rPr>
+        <w:t>ON UPDATE CASCADE;</w:t>
+      </w:r>
+    </w:p>
+    <w:p>
+      <w:pPr>
+        <w:spacing w:after="0" w:line="240" w:lineRule="auto"/>
+      </w:pPr>
+      <w:r>
+        <w:rPr>
+          <w:rFonts w:ascii="Courier New" w:hAnsi="Courier New"/>
+          <w:sz w:val="18"/>
+        </w:rPr>
+        <w:t xml:space="preserve"> </w:t>
+      </w:r>
+    </w:p>
+    <w:p>
+      <w:pPr>
+        <w:spacing w:after="0" w:line="240" w:lineRule="auto"/>
+      </w:pPr>
+      <w:r>
+        <w:rPr>
+          <w:rFonts w:ascii="Courier New" w:hAnsi="Courier New"/>
+          <w:sz w:val="18"/>
+        </w:rPr>
+        <w:t>ALTER TABLE car_parts</w:t>
+      </w:r>
+    </w:p>
+    <w:p>
+      <w:pPr>
+        <w:spacing w:after="0" w:line="240" w:lineRule="auto"/>
+      </w:pPr>
+      <w:r>
+        <w:rPr>
+          <w:rFonts w:ascii="Courier New" w:hAnsi="Courier New"/>
+          <w:sz w:val="18"/>
+        </w:rPr>
+        <w:t>ADD CONSTRAINT car_parts_FK2 FOREIGN KEY (part_ID)</w:t>
+      </w:r>
+    </w:p>
+    <w:p>
+      <w:pPr>
+        <w:spacing w:after="0" w:line="240" w:lineRule="auto"/>
+      </w:pPr>
+      <w:r>
+        <w:rPr>
+          <w:rFonts w:ascii="Courier New" w:hAnsi="Courier New"/>
+          <w:sz w:val="18"/>
+        </w:rPr>
+        <w:t>REFERENCES parts (part_ID)</w:t>
+      </w:r>
+    </w:p>
+    <w:p>
+      <w:pPr>
+        <w:spacing w:after="0" w:line="240" w:lineRule="auto"/>
+      </w:pPr>
+      <w:r>
+        <w:rPr>
+          <w:rFonts w:ascii="Courier New" w:hAnsi="Courier New"/>
+          <w:sz w:val="18"/>
+        </w:rPr>
+        <w:t>ON DELETE RESTRICT</w:t>
       </w:r>
     </w:p>
     <w:p>
@@ -4797,7 +5149,7 @@
           <w:b w:val="0"/>
           <w:sz w:val="24"/>
         </w:rPr>
-        <w:t>Рисунок 4 — Таблица parts: составной первичный ключ и идентифицирующая связь с cars</w:t>
+        <w:t>Рисунок 4 — Таблица car_parts: составной первичный ключ и связи с cars и parts</w:t>
       </w:r>
     </w:p>
     <w:p>
@@ -4824,7 +5176,7 @@
           <w:b w:val="0"/>
           <w:sz w:val="28"/>
         </w:rPr>
-        <w:t>PostgreSQL автоматически создаёт уникальный индекс для каждого первичного ключа и ограничения UNIQUE (пособие, с. 72), но не создаёт индекс для внешнего ключа (с. 73). Поэтому на столбцы внешних ключей созданы индексы B-дерева; они ускоряют соединение таблиц и проверку ссылочной целостности при удалении и изменении родительской строки. Для parts.car_ID отдельный индекс не нужен: этот столбец — первый в составном первичном ключе (car_ID, part_ID). Всего в базе 14 индексов (таблица 9).</w:t>
+        <w:t>PostgreSQL автоматически создаёт уникальный индекс для каждого первичного ключа и ограничения UNIQUE (пособие, с. 72), но не создаёт индекс для внешнего ключа (с. 73). Поэтому на столбцы внешних ключей созданы индексы B-дерева; они ускоряют соединение таблиц и проверку ссылочной целостности при удалении и изменении родительской строки. Для car_parts.car_ID отдельный индекс не нужен: этот столбец — первый в составном первичном ключе (car_ID, part_ID); для car_parts.part_ID индекс создан. Всего в базе 16 индексов (таблица 10).</w:t>
       </w:r>
     </w:p>
     <w:p>
@@ -4837,7 +5189,7 @@
           <w:b w:val="0"/>
           <w:sz w:val="24"/>
         </w:rPr>
-        <w:t>Таблица 9 — Индексы</w:t>
+        <w:t>Таблица 10 — Индексы</w:t>
       </w:r>
     </w:p>
     <w:tbl>
@@ -4910,7 +5262,7 @@
               <w:rPr>
                 <w:sz w:val="22"/>
               </w:rPr>
-              <w:t>teams_PK, cars_PK, drivers_PK, sponsors_PK, tracks_PK, races_PK</w:t>
+              <w:t>teams_PK, cars_PK, drivers_PK, parts_PK, sponsors_PK, tracks_PK, races_PK</w:t>
             </w:r>
           </w:p>
         </w:tc>
@@ -4954,7 +5306,7 @@
               <w:rPr>
                 <w:sz w:val="22"/>
               </w:rPr>
-              <w:t>parts_PK</w:t>
+              <w:t>car_parts_PK</w:t>
             </w:r>
           </w:p>
         </w:tc>
@@ -4982,7 +5334,7 @@
               <w:rPr>
                 <w:sz w:val="22"/>
               </w:rPr>
-              <w:t>автоматически (PRIMARY KEY); покрывает и внешний ключ parts.car_ID</w:t>
+              <w:t>автоматически (PRIMARY KEY); покрывает и внешний ключ car_parts.car_ID</w:t>
             </w:r>
           </w:p>
         </w:tc>
@@ -5130,6 +5482,50 @@
               <w:rPr>
                 <w:sz w:val="22"/>
               </w:rPr>
+              <w:t>car_parts_part_IDX</w:t>
+            </w:r>
+          </w:p>
+        </w:tc>
+        <w:tc>
+          <w:tcPr>
+            <w:tcW w:type="dxa" w:w="2551"/>
+          </w:tcPr>
+          <w:p>
+            <w:r/>
+            <w:r>
+              <w:rPr>
+                <w:sz w:val="22"/>
+              </w:rPr>
+              <w:t>car_parts.part_ID</w:t>
+            </w:r>
+          </w:p>
+        </w:tc>
+        <w:tc>
+          <w:tcPr>
+            <w:tcW w:type="dxa" w:w="3118"/>
+          </w:tcPr>
+          <w:p>
+            <w:r/>
+            <w:r>
+              <w:rPr>
+                <w:sz w:val="22"/>
+              </w:rPr>
+              <w:t>CREATE INDEX</w:t>
+            </w:r>
+          </w:p>
+        </w:tc>
+      </w:tr>
+      <w:tr>
+        <w:tc>
+          <w:tcPr>
+            <w:tcW w:type="dxa" w:w="3685"/>
+          </w:tcPr>
+          <w:p>
+            <w:r/>
+            <w:r>
+              <w:rPr>
+                <w:sz w:val="22"/>
+              </w:rPr>
               <w:t>races_track_IDX</w:t>
             </w:r>
           </w:p>
@@ -5242,6 +5638,18 @@
           <w:rFonts w:ascii="Courier New" w:hAnsi="Courier New"/>
           <w:sz w:val="18"/>
         </w:rPr>
+        <w:t>CREATE INDEX car_parts_part_IDX ON car_parts (part_ID);</w:t>
+      </w:r>
+    </w:p>
+    <w:p>
+      <w:pPr>
+        <w:spacing w:after="0" w:line="240" w:lineRule="auto"/>
+      </w:pPr>
+      <w:r>
+        <w:rPr>
+          <w:rFonts w:ascii="Courier New" w:hAnsi="Courier New"/>
+          <w:sz w:val="18"/>
+        </w:rPr>
         <w:t>CREATE INDEX races_track_IDX ON races (track_ID);</w:t>
       </w:r>
     </w:p>
@@ -5341,7 +5749,7 @@
           <w:b w:val="0"/>
           <w:sz w:val="28"/>
         </w:rPr>
-        <w:t>Скрипт 03_check.sql выводит из системного каталога список таблиц, полей, ограничений и индексов, а затем внутри транзакции вставляет тестовые данные и пытается нарушить каждое ограничение. В конце выполняется ROLLBACK, поэтому база остаётся пустой. Результаты приведены в таблице 10 и на рисунке 6, полный вывод — в файле check_output.txt.</w:t>
+        <w:t>Скрипт 03_check.sql выводит из системного каталога список таблиц, полей, ограничений и индексов, а затем внутри транзакции вставляет тестовые данные и пытается нарушить каждое ограничение. В конце выполняется ROLLBACK, поэтому база остаётся пустой. Результаты приведены в таблице 11 и на рисунке 6, полный вывод — в файле check_output.txt.</w:t>
       </w:r>
     </w:p>
     <w:p>
@@ -5354,7 +5762,7 @@
           <w:b w:val="0"/>
           <w:sz w:val="24"/>
         </w:rPr>
-        <w:t>Таблица 10 — Проверка ограничений</w:t>
+        <w:t>Таблица 11 — Проверка ограничений</w:t>
       </w:r>
     </w:p>
     <w:tbl>
@@ -5441,7 +5849,7 @@
               <w:rPr>
                 <w:sz w:val="22"/>
               </w:rPr>
-              <w:t>Повтор пары (car_ID, part_ID) в parts</w:t>
+              <w:t>Повтор пары (car_ID, part_ID) в car_parts</w:t>
             </w:r>
           </w:p>
         </w:tc>
@@ -5455,7 +5863,67 @@
               <w:rPr>
                 <w:sz w:val="22"/>
               </w:rPr>
-              <w:t>unique_violation (parts_PK)</w:t>
+              <w:t>unique_violation (car_parts_PK)</w:t>
+            </w:r>
+          </w:p>
+        </w:tc>
+      </w:tr>
+      <w:tr>
+        <w:tc>
+          <w:tcPr>
+            <w:tcW w:type="dxa" w:w="4535"/>
+          </w:tcPr>
+          <w:p>
+            <w:r/>
+            <w:r>
+              <w:rPr>
+                <w:sz w:val="22"/>
+              </w:rPr>
+              <w:t>Привязка к болиду несуществующей запчасти</w:t>
+            </w:r>
+          </w:p>
+        </w:tc>
+        <w:tc>
+          <w:tcPr>
+            <w:tcW w:type="dxa" w:w="4819"/>
+          </w:tcPr>
+          <w:p>
+            <w:r/>
+            <w:r>
+              <w:rPr>
+                <w:sz w:val="22"/>
+              </w:rPr>
+              <w:t>foreign_key_violation (car_parts_FK2)</w:t>
+            </w:r>
+          </w:p>
+        </w:tc>
+      </w:tr>
+      <w:tr>
+        <w:tc>
+          <w:tcPr>
+            <w:tcW w:type="dxa" w:w="4535"/>
+          </w:tcPr>
+          <w:p>
+            <w:r/>
+            <w:r>
+              <w:rPr>
+                <w:sz w:val="22"/>
+              </w:rPr>
+              <w:t>Удаление запчасти, установленной в болиды</w:t>
+            </w:r>
+          </w:p>
+        </w:tc>
+        <w:tc>
+          <w:tcPr>
+            <w:tcW w:type="dxa" w:w="4819"/>
+          </w:tcPr>
+          <w:p>
+            <w:r/>
+            <w:r>
+              <w:rPr>
+                <w:sz w:val="22"/>
+              </w:rPr>
+              <w:t>foreign_key_violation или restrict_violation (car_parts_FK2, RESTRICT)</w:t>
             </w:r>
           </w:p>
         </w:tc>
@@ -5725,7 +6193,7 @@
               <w:rPr>
                 <w:sz w:val="22"/>
               </w:rPr>
-              <w:t>удалены её болид, пилот и запчасти болида (ON DELETE CASCADE)</w:t>
+              <w:t>удалены её болид, пилот и привязки запчастей к болиду; справочник parts не изменился (ON DELETE CASCADE)</w:t>
             </w:r>
           </w:p>
         </w:tc>
@@ -5810,7 +6278,7 @@
           <w:b w:val="0"/>
           <w:sz w:val="28"/>
         </w:rPr>
-        <w:t>ER-диаграмма построена в pgAdmin командой Tools &gt; ERD Tool, пункт ERD for Database (пособие, с. 80). Она совпадает с моделью ЛР 1: семь таблиц и пять связей «один-ко-многим».</w:t>
+        <w:t>ER-диаграмма построена в pgAdmin командой Tools &gt; ERD Tool, пункт ERD for Database (пособие, с. 80). На ней восемь таблиц и шесть связей «один-ко-многим», две из которых образуют связь «многие-ко-многим» болидов и запчастей.</w:t>
       </w:r>
     </w:p>
     <w:p>
@@ -5891,7 +6359,7 @@
           <w:b w:val="0"/>
           <w:sz w:val="28"/>
         </w:rPr>
-        <w:t>В ходе работы в PostgreSQL 15 создана база данных formula1 из семи таблиц. Определены типы полей, первичные ключи (в том числе составной ключ зависимой таблицы parts), пять внешних ключей с действиями ON DELETE и ON UPDATE, ограничения NOT NULL, UNIQUE и CHECK, а также индексы на столбцы внешних ключей. Проверка на тестовых данных показала, что все ограничения отклоняют некорректные данные, а каскадные действия работают согласно модели предметной области.</w:t>
+        <w:t>В ходе работы в PostgreSQL 15 создана база данных formula1 из восьми таблиц. Определены типы полей, первичные ключи (в том числе составной ключ связующей таблицы car_parts), шесть внешних ключей с действиями ON DELETE и ON UPDATE, ограничения NOT NULL, UNIQUE и CHECK, а также индексы на столбцы внешних ключей. Проверка на тестовых данных показала, что все ограничения отклоняют некорректные данные, а каскадные действия работают согласно модели предметной области.</w:t>
       </w:r>
     </w:p>
     <w:sectPr>

</xml_diff>

<commit_message>
feat(dbms): lab 2 add results table linking races, drivers and cars
Co-Authored-By: Devin AI <158243242+devin-ai-integration[bot]@users.noreply.github.com>
</commit_message>
<xml_diff>
--- a/DBMS/solution/lab2/report.docx
+++ b/DBMS/solution/lab2/report.docx
@@ -551,7 +551,7 @@
           <w:b w:val="0"/>
           <w:sz w:val="28"/>
         </w:rPr>
-        <w:t>Предметная область — чемпионат «Формула-1». Модель данных (ЛР 1) содержит сущности Команды, Болиды, Пилоты, Запчасти, Спонсоры, Трассы и Гонки. Команда имеет много болидов и пилотов, на трассе и при участии спонсора проводится много гонок. Болид и запчасть связаны отношением «многие-ко-многим»: в болиде много запчастей, а одна запчасть из справочника может стоять в нескольких болидах. Такая связь реализуется отдельной таблицей car_parts (Запчасти болидов), которая хранит пары «болид — запчасть».</w:t>
+        <w:t>Предметная область — чемпионат «Формула-1». Модель данных (ЛР 1) содержит сущности Команды, Болиды, Пилоты, Запчасти, Спонсоры, Трассы и Гонки. Команда имеет много болидов и пилотов, на трассе и при участии спонсора проводится много гонок. Болид и запчасть связаны отношением «многие-ко-многим»: в болиде много запчастей, а одна запчасть из справочника может стоять в нескольких болидах. Такая связь реализуется отдельной таблицей car_parts (Запчасти болидов), которая хранит пары «болид — запчасть». Результаты пилотов в гонках хранятся в таблице results (Результаты гонок): она связывает гонку, пилота и болид и объединяет обе части модели — команды с болидами и пилотами и гонки на трассах с участием спонсоров.</w:t>
       </w:r>
     </w:p>
     <w:p>
@@ -829,7 +829,7 @@
           <w:b w:val="0"/>
           <w:sz w:val="28"/>
         </w:rPr>
-        <w:t>По физической модели из ЛР 1 созданы восемь таблиц: семь сущностей и связующая таблица car_parts. Как рекомендует пособие (с. 76), в инструкциях CREATE TABLE заданы только ограничения NOT NULL и PRIMARY KEY, остальные ограничения добавляются отдельными инструкциями ALTER TABLE (файл 02_create_tables.sql). Структура таблиц приведена в таблицах 1–8.</w:t>
+        <w:t>По физической модели из ЛР 1 созданы девять таблиц: семь сущностей, связующая таблица car_parts и таблица результатов гонок results. Как рекомендует пособие (с. 76), в инструкциях CREATE TABLE заданы только ограничения NOT NULL и PRIMARY KEY, остальные ограничения добавляются отдельными инструкциями ALTER TABLE (файл 02_create_tables.sql). Структура таблиц приведена в таблицах 1–9.</w:t>
       </w:r>
     </w:p>
     <w:p>
@@ -3179,6 +3179,386 @@
     <w:p>
       <w:pPr>
         <w:spacing w:after="0" w:line="240" w:lineRule="auto"/>
+        <w:ind w:firstLine="0"/>
+      </w:pPr>
+      <w:r>
+        <w:rPr>
+          <w:b w:val="0"/>
+          <w:sz w:val="24"/>
+        </w:rPr>
+        <w:t>Таблица 9 — results (Результаты гонок)</w:t>
+      </w:r>
+    </w:p>
+    <w:tbl>
+      <w:tblPr>
+        <w:tblStyle w:val="TableGrid"/>
+        <w:tblW w:type="auto" w:w="0"/>
+        <w:jc w:val="center"/>
+        <w:tblLook w:firstColumn="1" w:firstRow="1" w:lastColumn="0" w:lastRow="0" w:noHBand="0" w:noVBand="1" w:val="04A0"/>
+      </w:tblPr>
+      <w:tblGrid>
+        <w:gridCol w:w="2339"/>
+        <w:gridCol w:w="2339"/>
+        <w:gridCol w:w="2339"/>
+        <w:gridCol w:w="2339"/>
+      </w:tblGrid>
+      <w:tr>
+        <w:tc>
+          <w:tcPr>
+            <w:tcW w:type="dxa" w:w="1701"/>
+          </w:tcPr>
+          <w:p>
+            <w:r/>
+            <w:r>
+              <w:rPr>
+                <w:b/>
+                <w:sz w:val="22"/>
+              </w:rPr>
+              <w:t>Поле</w:t>
+            </w:r>
+          </w:p>
+        </w:tc>
+        <w:tc>
+          <w:tcPr>
+            <w:tcW w:type="dxa" w:w="1814"/>
+          </w:tcPr>
+          <w:p>
+            <w:r/>
+            <w:r>
+              <w:rPr>
+                <w:b/>
+                <w:sz w:val="22"/>
+              </w:rPr>
+              <w:t>Тип</w:t>
+            </w:r>
+          </w:p>
+        </w:tc>
+        <w:tc>
+          <w:tcPr>
+            <w:tcW w:type="dxa" w:w="2835"/>
+          </w:tcPr>
+          <w:p>
+            <w:r/>
+            <w:r>
+              <w:rPr>
+                <w:b/>
+                <w:sz w:val="22"/>
+              </w:rPr>
+              <w:t>Ограничения</w:t>
+            </w:r>
+          </w:p>
+        </w:tc>
+        <w:tc>
+          <w:tcPr>
+            <w:tcW w:type="dxa" w:w="3005"/>
+          </w:tcPr>
+          <w:p>
+            <w:r/>
+            <w:r>
+              <w:rPr>
+                <w:b/>
+                <w:sz w:val="22"/>
+              </w:rPr>
+              <w:t>Описание</w:t>
+            </w:r>
+          </w:p>
+        </w:tc>
+      </w:tr>
+      <w:tr>
+        <w:tc>
+          <w:tcPr>
+            <w:tcW w:type="dxa" w:w="1701"/>
+          </w:tcPr>
+          <w:p>
+            <w:r/>
+            <w:r>
+              <w:rPr>
+                <w:sz w:val="22"/>
+              </w:rPr>
+              <w:t>race_ID</w:t>
+            </w:r>
+          </w:p>
+        </w:tc>
+        <w:tc>
+          <w:tcPr>
+            <w:tcW w:type="dxa" w:w="1814"/>
+          </w:tcPr>
+          <w:p>
+            <w:r/>
+            <w:r>
+              <w:rPr>
+                <w:sz w:val="22"/>
+              </w:rPr>
+              <w:t>integer</w:t>
+            </w:r>
+          </w:p>
+        </w:tc>
+        <w:tc>
+          <w:tcPr>
+            <w:tcW w:type="dxa" w:w="2835"/>
+          </w:tcPr>
+          <w:p>
+            <w:r/>
+            <w:r>
+              <w:rPr>
+                <w:sz w:val="22"/>
+              </w:rPr>
+              <w:t>PK, FK → races, NOT NULL</w:t>
+            </w:r>
+          </w:p>
+        </w:tc>
+        <w:tc>
+          <w:tcPr>
+            <w:tcW w:type="dxa" w:w="3005"/>
+          </w:tcPr>
+          <w:p>
+            <w:r/>
+            <w:r>
+              <w:rPr>
+                <w:sz w:val="22"/>
+              </w:rPr>
+              <w:t>Гонка</w:t>
+            </w:r>
+          </w:p>
+        </w:tc>
+      </w:tr>
+      <w:tr>
+        <w:tc>
+          <w:tcPr>
+            <w:tcW w:type="dxa" w:w="1701"/>
+          </w:tcPr>
+          <w:p>
+            <w:r/>
+            <w:r>
+              <w:rPr>
+                <w:sz w:val="22"/>
+              </w:rPr>
+              <w:t>driver_ID</w:t>
+            </w:r>
+          </w:p>
+        </w:tc>
+        <w:tc>
+          <w:tcPr>
+            <w:tcW w:type="dxa" w:w="1814"/>
+          </w:tcPr>
+          <w:p>
+            <w:r/>
+            <w:r>
+              <w:rPr>
+                <w:sz w:val="22"/>
+              </w:rPr>
+              <w:t>integer</w:t>
+            </w:r>
+          </w:p>
+        </w:tc>
+        <w:tc>
+          <w:tcPr>
+            <w:tcW w:type="dxa" w:w="2835"/>
+          </w:tcPr>
+          <w:p>
+            <w:r/>
+            <w:r>
+              <w:rPr>
+                <w:sz w:val="22"/>
+              </w:rPr>
+              <w:t>PK, FK → drivers, NOT NULL</w:t>
+            </w:r>
+          </w:p>
+        </w:tc>
+        <w:tc>
+          <w:tcPr>
+            <w:tcW w:type="dxa" w:w="3005"/>
+          </w:tcPr>
+          <w:p>
+            <w:r/>
+            <w:r>
+              <w:rPr>
+                <w:sz w:val="22"/>
+              </w:rPr>
+              <w:t>Пилот</w:t>
+            </w:r>
+          </w:p>
+        </w:tc>
+      </w:tr>
+      <w:tr>
+        <w:tc>
+          <w:tcPr>
+            <w:tcW w:type="dxa" w:w="1701"/>
+          </w:tcPr>
+          <w:p>
+            <w:r/>
+            <w:r>
+              <w:rPr>
+                <w:sz w:val="22"/>
+              </w:rPr>
+              <w:t>car_ID</w:t>
+            </w:r>
+          </w:p>
+        </w:tc>
+        <w:tc>
+          <w:tcPr>
+            <w:tcW w:type="dxa" w:w="1814"/>
+          </w:tcPr>
+          <w:p>
+            <w:r/>
+            <w:r>
+              <w:rPr>
+                <w:sz w:val="22"/>
+              </w:rPr>
+              <w:t>integer</w:t>
+            </w:r>
+          </w:p>
+        </w:tc>
+        <w:tc>
+          <w:tcPr>
+            <w:tcW w:type="dxa" w:w="2835"/>
+          </w:tcPr>
+          <w:p>
+            <w:r/>
+            <w:r>
+              <w:rPr>
+                <w:sz w:val="22"/>
+              </w:rPr>
+              <w:t>FK → cars, NOT NULL</w:t>
+            </w:r>
+          </w:p>
+        </w:tc>
+        <w:tc>
+          <w:tcPr>
+            <w:tcW w:type="dxa" w:w="3005"/>
+          </w:tcPr>
+          <w:p>
+            <w:r/>
+            <w:r>
+              <w:rPr>
+                <w:sz w:val="22"/>
+              </w:rPr>
+              <w:t>Болид, на котором выступал пилот</w:t>
+            </w:r>
+          </w:p>
+        </w:tc>
+      </w:tr>
+      <w:tr>
+        <w:tc>
+          <w:tcPr>
+            <w:tcW w:type="dxa" w:w="1701"/>
+          </w:tcPr>
+          <w:p>
+            <w:r/>
+            <w:r>
+              <w:rPr>
+                <w:sz w:val="22"/>
+              </w:rPr>
+              <w:t>position</w:t>
+            </w:r>
+          </w:p>
+        </w:tc>
+        <w:tc>
+          <w:tcPr>
+            <w:tcW w:type="dxa" w:w="1814"/>
+          </w:tcPr>
+          <w:p>
+            <w:r/>
+            <w:r>
+              <w:rPr>
+                <w:sz w:val="22"/>
+              </w:rPr>
+              <w:t>integer</w:t>
+            </w:r>
+          </w:p>
+        </w:tc>
+        <w:tc>
+          <w:tcPr>
+            <w:tcW w:type="dxa" w:w="2835"/>
+          </w:tcPr>
+          <w:p>
+            <w:r/>
+            <w:r>
+              <w:rPr>
+                <w:sz w:val="22"/>
+              </w:rPr>
+              <w:t>NOT NULL, CHECK ≥ 1, UNIQUE вместе с race_ID</w:t>
+            </w:r>
+          </w:p>
+        </w:tc>
+        <w:tc>
+          <w:tcPr>
+            <w:tcW w:type="dxa" w:w="3005"/>
+          </w:tcPr>
+          <w:p>
+            <w:r/>
+            <w:r>
+              <w:rPr>
+                <w:sz w:val="22"/>
+              </w:rPr>
+              <w:t>Место на финише</w:t>
+            </w:r>
+          </w:p>
+        </w:tc>
+      </w:tr>
+      <w:tr>
+        <w:tc>
+          <w:tcPr>
+            <w:tcW w:type="dxa" w:w="1701"/>
+          </w:tcPr>
+          <w:p>
+            <w:r/>
+            <w:r>
+              <w:rPr>
+                <w:sz w:val="22"/>
+              </w:rPr>
+              <w:t>points</w:t>
+            </w:r>
+          </w:p>
+        </w:tc>
+        <w:tc>
+          <w:tcPr>
+            <w:tcW w:type="dxa" w:w="1814"/>
+          </w:tcPr>
+          <w:p>
+            <w:r/>
+            <w:r>
+              <w:rPr>
+                <w:sz w:val="22"/>
+              </w:rPr>
+              <w:t>numeric(4,1)</w:t>
+            </w:r>
+          </w:p>
+        </w:tc>
+        <w:tc>
+          <w:tcPr>
+            <w:tcW w:type="dxa" w:w="2835"/>
+          </w:tcPr>
+          <w:p>
+            <w:r/>
+            <w:r>
+              <w:rPr>
+                <w:sz w:val="22"/>
+              </w:rPr>
+              <w:t>NOT NULL, CHECK ≥ 0</w:t>
+            </w:r>
+          </w:p>
+        </w:tc>
+        <w:tc>
+          <w:tcPr>
+            <w:tcW w:type="dxa" w:w="3005"/>
+          </w:tcPr>
+          <w:p>
+            <w:r/>
+            <w:r>
+              <w:rPr>
+                <w:sz w:val="22"/>
+              </w:rPr>
+              <w:t>Набранные очки</w:t>
+            </w:r>
+          </w:p>
+        </w:tc>
+      </w:tr>
+    </w:tbl>
+    <w:p/>
+    <w:p>
+      <w:pPr>
+        <w:spacing w:after="0" w:line="240" w:lineRule="auto"/>
       </w:pPr>
       <w:r>
         <w:rPr>
@@ -3870,6 +4250,114 @@
           <w:sz w:val="18"/>
         </w:rPr>
         <w:t xml:space="preserve">    CONSTRAINT races_PK PRIMARY KEY (race_ID)</w:t>
+      </w:r>
+    </w:p>
+    <w:p>
+      <w:pPr>
+        <w:spacing w:after="0" w:line="240" w:lineRule="auto"/>
+      </w:pPr>
+      <w:r>
+        <w:rPr>
+          <w:rFonts w:ascii="Courier New" w:hAnsi="Courier New"/>
+          <w:sz w:val="18"/>
+        </w:rPr>
+        <w:t>);</w:t>
+      </w:r>
+    </w:p>
+    <w:p>
+      <w:pPr>
+        <w:spacing w:after="0" w:line="240" w:lineRule="auto"/>
+      </w:pPr>
+      <w:r>
+        <w:rPr>
+          <w:rFonts w:ascii="Courier New" w:hAnsi="Courier New"/>
+          <w:sz w:val="18"/>
+        </w:rPr>
+        <w:t xml:space="preserve"> </w:t>
+      </w:r>
+    </w:p>
+    <w:p>
+      <w:pPr>
+        <w:spacing w:after="0" w:line="240" w:lineRule="auto"/>
+      </w:pPr>
+      <w:r>
+        <w:rPr>
+          <w:rFonts w:ascii="Courier New" w:hAnsi="Courier New"/>
+          <w:sz w:val="18"/>
+        </w:rPr>
+        <w:t>CREATE TABLE results (</w:t>
+      </w:r>
+    </w:p>
+    <w:p>
+      <w:pPr>
+        <w:spacing w:after="0" w:line="240" w:lineRule="auto"/>
+      </w:pPr>
+      <w:r>
+        <w:rPr>
+          <w:rFonts w:ascii="Courier New" w:hAnsi="Courier New"/>
+          <w:sz w:val="18"/>
+        </w:rPr>
+        <w:t xml:space="preserve">    race_ID integer NOT NULL,</w:t>
+      </w:r>
+    </w:p>
+    <w:p>
+      <w:pPr>
+        <w:spacing w:after="0" w:line="240" w:lineRule="auto"/>
+      </w:pPr>
+      <w:r>
+        <w:rPr>
+          <w:rFonts w:ascii="Courier New" w:hAnsi="Courier New"/>
+          <w:sz w:val="18"/>
+        </w:rPr>
+        <w:t xml:space="preserve">    driver_ID integer NOT NULL,</w:t>
+      </w:r>
+    </w:p>
+    <w:p>
+      <w:pPr>
+        <w:spacing w:after="0" w:line="240" w:lineRule="auto"/>
+      </w:pPr>
+      <w:r>
+        <w:rPr>
+          <w:rFonts w:ascii="Courier New" w:hAnsi="Courier New"/>
+          <w:sz w:val="18"/>
+        </w:rPr>
+        <w:t xml:space="preserve">    car_ID integer NOT NULL,</w:t>
+      </w:r>
+    </w:p>
+    <w:p>
+      <w:pPr>
+        <w:spacing w:after="0" w:line="240" w:lineRule="auto"/>
+      </w:pPr>
+      <w:r>
+        <w:rPr>
+          <w:rFonts w:ascii="Courier New" w:hAnsi="Courier New"/>
+          <w:sz w:val="18"/>
+        </w:rPr>
+        <w:t xml:space="preserve">    position integer NOT NULL,</w:t>
+      </w:r>
+    </w:p>
+    <w:p>
+      <w:pPr>
+        <w:spacing w:after="0" w:line="240" w:lineRule="auto"/>
+      </w:pPr>
+      <w:r>
+        <w:rPr>
+          <w:rFonts w:ascii="Courier New" w:hAnsi="Courier New"/>
+          <w:sz w:val="18"/>
+        </w:rPr>
+        <w:t xml:space="preserve">    points numeric(4,1) NOT NULL,</w:t>
+      </w:r>
+    </w:p>
+    <w:p>
+      <w:pPr>
+        <w:spacing w:after="0" w:line="240" w:lineRule="auto"/>
+      </w:pPr>
+      <w:r>
+        <w:rPr>
+          <w:rFonts w:ascii="Courier New" w:hAnsi="Courier New"/>
+          <w:sz w:val="18"/>
+        </w:rPr>
+        <w:t xml:space="preserve">    CONSTRAINT results_PK PRIMARY KEY (race_ID, driver_ID)</w:t>
       </w:r>
     </w:p>
     <w:p>
@@ -3968,7 +4456,7 @@
           <w:b w:val="0"/>
           <w:sz w:val="28"/>
         </w:rPr>
-        <w:t>Связи «один-ко-многим» из модели ЛР 1 реализованы внешними ключами (таблица 9); связь «многие-ко-многим» болидов и запчастей разложена на две связи «один-ко-многим» через таблицу car_parts. Для данных, принадлежащих команде и болиду, выбрано каскадное удаление и обновление, как в образце пособия (с. 79): при удалении команды удаляются её болиды и пилоты, при удалении болида — привязки запчастей к нему (сама запчасть остаётся в справочнике parts). Запчасть, установленную хотя бы в один болид, удалить нельзя (RESTRICT). Трассу и спонсора, у которых есть гонки, удалить нельзя (RESTRICT), чтобы не потерять результаты гонок; изменение их ключа распространяется каскадно.</w:t>
+        <w:t>Связи «один-ко-многим» из модели ЛР 1 реализованы внешними ключами (таблица 10); связь «многие-ко-многим» болидов и запчастей разложена на две связи «один-ко-многим» через таблицу car_parts. Для данных, принадлежащих команде и болиду, выбрано каскадное удаление и обновление, как в образце пособия (с. 79): при удалении команды удаляются её болиды и пилоты, при удалении болида — привязки запчастей к нему (сама запчасть остаётся в справочнике parts). Запчасть, установленную хотя бы в один болид, удалить нельзя (RESTRICT). Трассу и спонсора, у которых есть гонки, удалить нельзя (RESTRICT), чтобы не потерять результаты гонок; изменение их ключа распространяется каскадно.</w:t>
       </w:r>
     </w:p>
     <w:p>
@@ -3981,7 +4469,7 @@
           <w:b w:val="0"/>
           <w:sz w:val="24"/>
         </w:rPr>
-        <w:t>Таблица 9 — Внешние ключи</w:t>
+        <w:t>Таблица 10 — Внешние ключи</w:t>
       </w:r>
     </w:p>
     <w:tbl>
@@ -4507,6 +4995,222 @@
           </w:p>
         </w:tc>
       </w:tr>
+      <w:tr>
+        <w:tc>
+          <w:tcPr>
+            <w:tcW w:type="dxa" w:w="1587"/>
+          </w:tcPr>
+          <w:p>
+            <w:r/>
+            <w:r>
+              <w:rPr>
+                <w:sz w:val="22"/>
+              </w:rPr>
+              <w:t>results_FK1</w:t>
+            </w:r>
+          </w:p>
+        </w:tc>
+        <w:tc>
+          <w:tcPr>
+            <w:tcW w:type="dxa" w:w="3402"/>
+          </w:tcPr>
+          <w:p>
+            <w:r/>
+            <w:r>
+              <w:rPr>
+                <w:sz w:val="22"/>
+              </w:rPr>
+              <w:t>results.race_ID → races.race_ID</w:t>
+            </w:r>
+          </w:p>
+        </w:tc>
+        <w:tc>
+          <w:tcPr>
+            <w:tcW w:type="dxa" w:w="1814"/>
+          </w:tcPr>
+          <w:p>
+            <w:r/>
+            <w:r>
+              <w:rPr>
+                <w:sz w:val="22"/>
+              </w:rPr>
+              <w:t>1:N, идентифицирующая</w:t>
+            </w:r>
+          </w:p>
+        </w:tc>
+        <w:tc>
+          <w:tcPr>
+            <w:tcW w:type="dxa" w:w="1304"/>
+          </w:tcPr>
+          <w:p>
+            <w:r/>
+            <w:r>
+              <w:rPr>
+                <w:sz w:val="22"/>
+              </w:rPr>
+              <w:t>CASCADE</w:t>
+            </w:r>
+          </w:p>
+        </w:tc>
+        <w:tc>
+          <w:tcPr>
+            <w:tcW w:type="dxa" w:w="1247"/>
+          </w:tcPr>
+          <w:p>
+            <w:r/>
+            <w:r>
+              <w:rPr>
+                <w:sz w:val="22"/>
+              </w:rPr>
+              <w:t>CASCADE</w:t>
+            </w:r>
+          </w:p>
+        </w:tc>
+      </w:tr>
+      <w:tr>
+        <w:tc>
+          <w:tcPr>
+            <w:tcW w:type="dxa" w:w="1587"/>
+          </w:tcPr>
+          <w:p>
+            <w:r/>
+            <w:r>
+              <w:rPr>
+                <w:sz w:val="22"/>
+              </w:rPr>
+              <w:t>results_FK2</w:t>
+            </w:r>
+          </w:p>
+        </w:tc>
+        <w:tc>
+          <w:tcPr>
+            <w:tcW w:type="dxa" w:w="3402"/>
+          </w:tcPr>
+          <w:p>
+            <w:r/>
+            <w:r>
+              <w:rPr>
+                <w:sz w:val="22"/>
+              </w:rPr>
+              <w:t>results.driver_ID → drivers.driver_ID</w:t>
+            </w:r>
+          </w:p>
+        </w:tc>
+        <w:tc>
+          <w:tcPr>
+            <w:tcW w:type="dxa" w:w="1814"/>
+          </w:tcPr>
+          <w:p>
+            <w:r/>
+            <w:r>
+              <w:rPr>
+                <w:sz w:val="22"/>
+              </w:rPr>
+              <w:t>1:N, идентифицирующая</w:t>
+            </w:r>
+          </w:p>
+        </w:tc>
+        <w:tc>
+          <w:tcPr>
+            <w:tcW w:type="dxa" w:w="1304"/>
+          </w:tcPr>
+          <w:p>
+            <w:r/>
+            <w:r>
+              <w:rPr>
+                <w:sz w:val="22"/>
+              </w:rPr>
+              <w:t>CASCADE</w:t>
+            </w:r>
+          </w:p>
+        </w:tc>
+        <w:tc>
+          <w:tcPr>
+            <w:tcW w:type="dxa" w:w="1247"/>
+          </w:tcPr>
+          <w:p>
+            <w:r/>
+            <w:r>
+              <w:rPr>
+                <w:sz w:val="22"/>
+              </w:rPr>
+              <w:t>CASCADE</w:t>
+            </w:r>
+          </w:p>
+        </w:tc>
+      </w:tr>
+      <w:tr>
+        <w:tc>
+          <w:tcPr>
+            <w:tcW w:type="dxa" w:w="1587"/>
+          </w:tcPr>
+          <w:p>
+            <w:r/>
+            <w:r>
+              <w:rPr>
+                <w:sz w:val="22"/>
+              </w:rPr>
+              <w:t>results_FK3</w:t>
+            </w:r>
+          </w:p>
+        </w:tc>
+        <w:tc>
+          <w:tcPr>
+            <w:tcW w:type="dxa" w:w="3402"/>
+          </w:tcPr>
+          <w:p>
+            <w:r/>
+            <w:r>
+              <w:rPr>
+                <w:sz w:val="22"/>
+              </w:rPr>
+              <w:t>results.car_ID → cars.car_ID</w:t>
+            </w:r>
+          </w:p>
+        </w:tc>
+        <w:tc>
+          <w:tcPr>
+            <w:tcW w:type="dxa" w:w="1814"/>
+          </w:tcPr>
+          <w:p>
+            <w:r/>
+            <w:r>
+              <w:rPr>
+                <w:sz w:val="22"/>
+              </w:rPr>
+              <w:t>1:N</w:t>
+            </w:r>
+          </w:p>
+        </w:tc>
+        <w:tc>
+          <w:tcPr>
+            <w:tcW w:type="dxa" w:w="1304"/>
+          </w:tcPr>
+          <w:p>
+            <w:r/>
+            <w:r>
+              <w:rPr>
+                <w:sz w:val="22"/>
+              </w:rPr>
+              <w:t>CASCADE</w:t>
+            </w:r>
+          </w:p>
+        </w:tc>
+        <w:tc>
+          <w:tcPr>
+            <w:tcW w:type="dxa" w:w="1247"/>
+          </w:tcPr>
+          <w:p>
+            <w:r/>
+            <w:r>
+              <w:rPr>
+                <w:sz w:val="22"/>
+              </w:rPr>
+              <w:t>CASCADE</w:t>
+            </w:r>
+          </w:p>
+        </w:tc>
+      </w:tr>
     </w:tbl>
     <w:p/>
     <w:p>
@@ -4519,7 +5223,7 @@
           <w:b w:val="0"/>
           <w:sz w:val="28"/>
         </w:rPr>
-        <w:t>Дополнительно заданы ограничения уникальности потенциальных ключей — названий команд, спонсоров и трасс (teams_name_UQ, sponsors_name_UQ, tracks_name_UQ) — и ограничения проверки: год болида от 1950 до 2100 (cars_year_CHK), неотрицательный бюджет спонсора (sponsors_budget_CHK), положительная длина трассы (tracks_length_CHK).</w:t>
+        <w:t>Дополнительно заданы ограничения уникальности потенциальных ключей — названий команд, спонсоров и трасс (teams_name_UQ, sponsors_name_UQ, tracks_name_UQ) — и ограничения проверки: год болида от 1950 до 2100 (cars_year_CHK), неотрицательный бюджет спонсора (sponsors_budget_CHK), положительная длина трассы (tracks_length_CHK). В таблице results одно место в гонке может занять только один пилот (results_position_UQ), место начинается с 1 (results_position_CHK), очки неотрицательны (results_points_CHK). Удаление гонки, пилота или болида каскадно удаляет связанные результаты.</w:t>
       </w:r>
     </w:p>
     <w:p>
@@ -4963,6 +5667,222 @@
           <w:rFonts w:ascii="Courier New" w:hAnsi="Courier New"/>
           <w:sz w:val="18"/>
         </w:rPr>
+        <w:t>ALTER TABLE results</w:t>
+      </w:r>
+    </w:p>
+    <w:p>
+      <w:pPr>
+        <w:spacing w:after="0" w:line="240" w:lineRule="auto"/>
+      </w:pPr>
+      <w:r>
+        <w:rPr>
+          <w:rFonts w:ascii="Courier New" w:hAnsi="Courier New"/>
+          <w:sz w:val="18"/>
+        </w:rPr>
+        <w:t>ADD CONSTRAINT results_FK1 FOREIGN KEY (race_ID)</w:t>
+      </w:r>
+    </w:p>
+    <w:p>
+      <w:pPr>
+        <w:spacing w:after="0" w:line="240" w:lineRule="auto"/>
+      </w:pPr>
+      <w:r>
+        <w:rPr>
+          <w:rFonts w:ascii="Courier New" w:hAnsi="Courier New"/>
+          <w:sz w:val="18"/>
+        </w:rPr>
+        <w:t>REFERENCES races (race_ID)</w:t>
+      </w:r>
+    </w:p>
+    <w:p>
+      <w:pPr>
+        <w:spacing w:after="0" w:line="240" w:lineRule="auto"/>
+      </w:pPr>
+      <w:r>
+        <w:rPr>
+          <w:rFonts w:ascii="Courier New" w:hAnsi="Courier New"/>
+          <w:sz w:val="18"/>
+        </w:rPr>
+        <w:t>ON DELETE CASCADE</w:t>
+      </w:r>
+    </w:p>
+    <w:p>
+      <w:pPr>
+        <w:spacing w:after="0" w:line="240" w:lineRule="auto"/>
+      </w:pPr>
+      <w:r>
+        <w:rPr>
+          <w:rFonts w:ascii="Courier New" w:hAnsi="Courier New"/>
+          <w:sz w:val="18"/>
+        </w:rPr>
+        <w:t>ON UPDATE CASCADE;</w:t>
+      </w:r>
+    </w:p>
+    <w:p>
+      <w:pPr>
+        <w:spacing w:after="0" w:line="240" w:lineRule="auto"/>
+      </w:pPr>
+      <w:r>
+        <w:rPr>
+          <w:rFonts w:ascii="Courier New" w:hAnsi="Courier New"/>
+          <w:sz w:val="18"/>
+        </w:rPr>
+        <w:t xml:space="preserve"> </w:t>
+      </w:r>
+    </w:p>
+    <w:p>
+      <w:pPr>
+        <w:spacing w:after="0" w:line="240" w:lineRule="auto"/>
+      </w:pPr>
+      <w:r>
+        <w:rPr>
+          <w:rFonts w:ascii="Courier New" w:hAnsi="Courier New"/>
+          <w:sz w:val="18"/>
+        </w:rPr>
+        <w:t>ALTER TABLE results</w:t>
+      </w:r>
+    </w:p>
+    <w:p>
+      <w:pPr>
+        <w:spacing w:after="0" w:line="240" w:lineRule="auto"/>
+      </w:pPr>
+      <w:r>
+        <w:rPr>
+          <w:rFonts w:ascii="Courier New" w:hAnsi="Courier New"/>
+          <w:sz w:val="18"/>
+        </w:rPr>
+        <w:t>ADD CONSTRAINT results_FK2 FOREIGN KEY (driver_ID)</w:t>
+      </w:r>
+    </w:p>
+    <w:p>
+      <w:pPr>
+        <w:spacing w:after="0" w:line="240" w:lineRule="auto"/>
+      </w:pPr>
+      <w:r>
+        <w:rPr>
+          <w:rFonts w:ascii="Courier New" w:hAnsi="Courier New"/>
+          <w:sz w:val="18"/>
+        </w:rPr>
+        <w:t>REFERENCES drivers (driver_ID)</w:t>
+      </w:r>
+    </w:p>
+    <w:p>
+      <w:pPr>
+        <w:spacing w:after="0" w:line="240" w:lineRule="auto"/>
+      </w:pPr>
+      <w:r>
+        <w:rPr>
+          <w:rFonts w:ascii="Courier New" w:hAnsi="Courier New"/>
+          <w:sz w:val="18"/>
+        </w:rPr>
+        <w:t>ON DELETE CASCADE</w:t>
+      </w:r>
+    </w:p>
+    <w:p>
+      <w:pPr>
+        <w:spacing w:after="0" w:line="240" w:lineRule="auto"/>
+      </w:pPr>
+      <w:r>
+        <w:rPr>
+          <w:rFonts w:ascii="Courier New" w:hAnsi="Courier New"/>
+          <w:sz w:val="18"/>
+        </w:rPr>
+        <w:t>ON UPDATE CASCADE;</w:t>
+      </w:r>
+    </w:p>
+    <w:p>
+      <w:pPr>
+        <w:spacing w:after="0" w:line="240" w:lineRule="auto"/>
+      </w:pPr>
+      <w:r>
+        <w:rPr>
+          <w:rFonts w:ascii="Courier New" w:hAnsi="Courier New"/>
+          <w:sz w:val="18"/>
+        </w:rPr>
+        <w:t xml:space="preserve"> </w:t>
+      </w:r>
+    </w:p>
+    <w:p>
+      <w:pPr>
+        <w:spacing w:after="0" w:line="240" w:lineRule="auto"/>
+      </w:pPr>
+      <w:r>
+        <w:rPr>
+          <w:rFonts w:ascii="Courier New" w:hAnsi="Courier New"/>
+          <w:sz w:val="18"/>
+        </w:rPr>
+        <w:t>ALTER TABLE results</w:t>
+      </w:r>
+    </w:p>
+    <w:p>
+      <w:pPr>
+        <w:spacing w:after="0" w:line="240" w:lineRule="auto"/>
+      </w:pPr>
+      <w:r>
+        <w:rPr>
+          <w:rFonts w:ascii="Courier New" w:hAnsi="Courier New"/>
+          <w:sz w:val="18"/>
+        </w:rPr>
+        <w:t>ADD CONSTRAINT results_FK3 FOREIGN KEY (car_ID)</w:t>
+      </w:r>
+    </w:p>
+    <w:p>
+      <w:pPr>
+        <w:spacing w:after="0" w:line="240" w:lineRule="auto"/>
+      </w:pPr>
+      <w:r>
+        <w:rPr>
+          <w:rFonts w:ascii="Courier New" w:hAnsi="Courier New"/>
+          <w:sz w:val="18"/>
+        </w:rPr>
+        <w:t>REFERENCES cars (car_ID)</w:t>
+      </w:r>
+    </w:p>
+    <w:p>
+      <w:pPr>
+        <w:spacing w:after="0" w:line="240" w:lineRule="auto"/>
+      </w:pPr>
+      <w:r>
+        <w:rPr>
+          <w:rFonts w:ascii="Courier New" w:hAnsi="Courier New"/>
+          <w:sz w:val="18"/>
+        </w:rPr>
+        <w:t>ON DELETE CASCADE</w:t>
+      </w:r>
+    </w:p>
+    <w:p>
+      <w:pPr>
+        <w:spacing w:after="0" w:line="240" w:lineRule="auto"/>
+      </w:pPr>
+      <w:r>
+        <w:rPr>
+          <w:rFonts w:ascii="Courier New" w:hAnsi="Courier New"/>
+          <w:sz w:val="18"/>
+        </w:rPr>
+        <w:t>ON UPDATE CASCADE;</w:t>
+      </w:r>
+    </w:p>
+    <w:p>
+      <w:pPr>
+        <w:spacing w:after="0" w:line="240" w:lineRule="auto"/>
+      </w:pPr>
+      <w:r>
+        <w:rPr>
+          <w:rFonts w:ascii="Courier New" w:hAnsi="Courier New"/>
+          <w:sz w:val="18"/>
+        </w:rPr>
+        <w:t xml:space="preserve"> </w:t>
+      </w:r>
+    </w:p>
+    <w:p>
+      <w:pPr>
+        <w:spacing w:after="0" w:line="240" w:lineRule="auto"/>
+      </w:pPr>
+      <w:r>
+        <w:rPr>
+          <w:rFonts w:ascii="Courier New" w:hAnsi="Courier New"/>
+          <w:sz w:val="18"/>
+        </w:rPr>
         <w:t>ALTER TABLE teams ADD CONSTRAINT teams_name_UQ UNIQUE (name);</w:t>
       </w:r>
     </w:p>
@@ -4999,6 +5919,18 @@
           <w:rFonts w:ascii="Courier New" w:hAnsi="Courier New"/>
           <w:sz w:val="18"/>
         </w:rPr>
+        <w:t>ALTER TABLE results ADD CONSTRAINT results_position_UQ UNIQUE (race_ID, position);</w:t>
+      </w:r>
+    </w:p>
+    <w:p>
+      <w:pPr>
+        <w:spacing w:after="0" w:line="240" w:lineRule="auto"/>
+      </w:pPr>
+      <w:r>
+        <w:rPr>
+          <w:rFonts w:ascii="Courier New" w:hAnsi="Courier New"/>
+          <w:sz w:val="18"/>
+        </w:rPr>
         <w:t xml:space="preserve"> </w:t>
       </w:r>
     </w:p>
@@ -5036,6 +5968,30 @@
           <w:sz w:val="18"/>
         </w:rPr>
         <w:t>ALTER TABLE tracks ADD CONSTRAINT tracks_length_CHK CHECK (length_km &gt; 0);</w:t>
+      </w:r>
+    </w:p>
+    <w:p>
+      <w:pPr>
+        <w:spacing w:after="0" w:line="240" w:lineRule="auto"/>
+      </w:pPr>
+      <w:r>
+        <w:rPr>
+          <w:rFonts w:ascii="Courier New" w:hAnsi="Courier New"/>
+          <w:sz w:val="18"/>
+        </w:rPr>
+        <w:t>ALTER TABLE results ADD CONSTRAINT results_position_CHK CHECK (position &gt;= 1);</w:t>
+      </w:r>
+    </w:p>
+    <w:p>
+      <w:pPr>
+        <w:spacing w:after="0" w:line="240" w:lineRule="auto"/>
+      </w:pPr>
+      <w:r>
+        <w:rPr>
+          <w:rFonts w:ascii="Courier New" w:hAnsi="Courier New"/>
+          <w:sz w:val="18"/>
+        </w:rPr>
+        <w:t>ALTER TABLE results ADD CONSTRAINT results_points_CHK CHECK (points &gt;= 0);</w:t>
       </w:r>
     </w:p>
     <w:p>
@@ -5176,7 +6132,7 @@
           <w:b w:val="0"/>
           <w:sz w:val="28"/>
         </w:rPr>
-        <w:t>PostgreSQL автоматически создаёт уникальный индекс для каждого первичного ключа и ограничения UNIQUE (пособие, с. 72), но не создаёт индекс для внешнего ключа (с. 73). Поэтому на столбцы внешних ключей созданы индексы B-дерева; они ускоряют соединение таблиц и проверку ссылочной целостности при удалении и изменении родительской строки. Для car_parts.car_ID отдельный индекс не нужен: этот столбец — первый в составном первичном ключе (car_ID, part_ID); для car_parts.part_ID индекс создан. Всего в базе 16 индексов (таблица 10).</w:t>
+        <w:t>PostgreSQL автоматически создаёт уникальный индекс для каждого первичного ключа и ограничения UNIQUE (пособие, с. 72), но не создаёт индекс для внешнего ключа (с. 73). Поэтому на столбцы внешних ключей созданы индексы B-дерева; они ускоряют соединение таблиц и проверку ссылочной целостности при удалении и изменении родительской строки. Для car_parts.car_ID отдельный индекс не нужен: этот столбец — первый в составном первичном ключе (car_ID, part_ID); для car_parts.part_ID индекс создан. Для results.race_ID индекс покрывает первичный ключ (race_ID, driver_ID), на driver_ID и car_ID созданы отдельные индексы. Всего в базе 20 индексов (таблица 11).</w:t>
       </w:r>
     </w:p>
     <w:p>
@@ -5189,7 +6145,7 @@
           <w:b w:val="0"/>
           <w:sz w:val="24"/>
         </w:rPr>
-        <w:t>Таблица 10 — Индексы</w:t>
+        <w:t>Таблица 11 — Индексы</w:t>
       </w:r>
     </w:p>
     <w:tbl>
@@ -5350,6 +6306,50 @@
               <w:rPr>
                 <w:sz w:val="22"/>
               </w:rPr>
+              <w:t>results_PK</w:t>
+            </w:r>
+          </w:p>
+        </w:tc>
+        <w:tc>
+          <w:tcPr>
+            <w:tcW w:type="dxa" w:w="2551"/>
+          </w:tcPr>
+          <w:p>
+            <w:r/>
+            <w:r>
+              <w:rPr>
+                <w:sz w:val="22"/>
+              </w:rPr>
+              <w:t>(race_ID, driver_ID)</w:t>
+            </w:r>
+          </w:p>
+        </w:tc>
+        <w:tc>
+          <w:tcPr>
+            <w:tcW w:type="dxa" w:w="3118"/>
+          </w:tcPr>
+          <w:p>
+            <w:r/>
+            <w:r>
+              <w:rPr>
+                <w:sz w:val="22"/>
+              </w:rPr>
+              <w:t>автоматически (PRIMARY KEY); покрывает и внешний ключ results.race_ID</w:t>
+            </w:r>
+          </w:p>
+        </w:tc>
+      </w:tr>
+      <w:tr>
+        <w:tc>
+          <w:tcPr>
+            <w:tcW w:type="dxa" w:w="3685"/>
+          </w:tcPr>
+          <w:p>
+            <w:r/>
+            <w:r>
+              <w:rPr>
+                <w:sz w:val="22"/>
+              </w:rPr>
               <w:t>teams_name_UQ, sponsors_name_UQ, tracks_name_UQ</w:t>
             </w:r>
           </w:p>
@@ -5365,6 +6365,50 @@
                 <w:sz w:val="22"/>
               </w:rPr>
               <w:t>name</w:t>
+            </w:r>
+          </w:p>
+        </w:tc>
+        <w:tc>
+          <w:tcPr>
+            <w:tcW w:type="dxa" w:w="3118"/>
+          </w:tcPr>
+          <w:p>
+            <w:r/>
+            <w:r>
+              <w:rPr>
+                <w:sz w:val="22"/>
+              </w:rPr>
+              <w:t>автоматически (UNIQUE)</w:t>
+            </w:r>
+          </w:p>
+        </w:tc>
+      </w:tr>
+      <w:tr>
+        <w:tc>
+          <w:tcPr>
+            <w:tcW w:type="dxa" w:w="3685"/>
+          </w:tcPr>
+          <w:p>
+            <w:r/>
+            <w:r>
+              <w:rPr>
+                <w:sz w:val="22"/>
+              </w:rPr>
+              <w:t>results_position_UQ</w:t>
+            </w:r>
+          </w:p>
+        </w:tc>
+        <w:tc>
+          <w:tcPr>
+            <w:tcW w:type="dxa" w:w="2551"/>
+          </w:tcPr>
+          <w:p>
+            <w:r/>
+            <w:r>
+              <w:rPr>
+                <w:sz w:val="22"/>
+              </w:rPr>
+              <w:t>(race_ID, position)</w:t>
             </w:r>
           </w:p>
         </w:tc>
@@ -5603,6 +6647,94 @@
           </w:p>
         </w:tc>
       </w:tr>
+      <w:tr>
+        <w:tc>
+          <w:tcPr>
+            <w:tcW w:type="dxa" w:w="3685"/>
+          </w:tcPr>
+          <w:p>
+            <w:r/>
+            <w:r>
+              <w:rPr>
+                <w:sz w:val="22"/>
+              </w:rPr>
+              <w:t>results_driver_IDX</w:t>
+            </w:r>
+          </w:p>
+        </w:tc>
+        <w:tc>
+          <w:tcPr>
+            <w:tcW w:type="dxa" w:w="2551"/>
+          </w:tcPr>
+          <w:p>
+            <w:r/>
+            <w:r>
+              <w:rPr>
+                <w:sz w:val="22"/>
+              </w:rPr>
+              <w:t>results.driver_ID</w:t>
+            </w:r>
+          </w:p>
+        </w:tc>
+        <w:tc>
+          <w:tcPr>
+            <w:tcW w:type="dxa" w:w="3118"/>
+          </w:tcPr>
+          <w:p>
+            <w:r/>
+            <w:r>
+              <w:rPr>
+                <w:sz w:val="22"/>
+              </w:rPr>
+              <w:t>CREATE INDEX</w:t>
+            </w:r>
+          </w:p>
+        </w:tc>
+      </w:tr>
+      <w:tr>
+        <w:tc>
+          <w:tcPr>
+            <w:tcW w:type="dxa" w:w="3685"/>
+          </w:tcPr>
+          <w:p>
+            <w:r/>
+            <w:r>
+              <w:rPr>
+                <w:sz w:val="22"/>
+              </w:rPr>
+              <w:t>results_car_IDX</w:t>
+            </w:r>
+          </w:p>
+        </w:tc>
+        <w:tc>
+          <w:tcPr>
+            <w:tcW w:type="dxa" w:w="2551"/>
+          </w:tcPr>
+          <w:p>
+            <w:r/>
+            <w:r>
+              <w:rPr>
+                <w:sz w:val="22"/>
+              </w:rPr>
+              <w:t>results.car_ID</w:t>
+            </w:r>
+          </w:p>
+        </w:tc>
+        <w:tc>
+          <w:tcPr>
+            <w:tcW w:type="dxa" w:w="3118"/>
+          </w:tcPr>
+          <w:p>
+            <w:r/>
+            <w:r>
+              <w:rPr>
+                <w:sz w:val="22"/>
+              </w:rPr>
+              <w:t>CREATE INDEX</w:t>
+            </w:r>
+          </w:p>
+        </w:tc>
+      </w:tr>
     </w:tbl>
     <w:p/>
     <w:p>
@@ -5663,6 +6795,30 @@
           <w:sz w:val="18"/>
         </w:rPr>
         <w:t>CREATE INDEX races_sponsor_IDX ON races (sponsor_ID);</w:t>
+      </w:r>
+    </w:p>
+    <w:p>
+      <w:pPr>
+        <w:spacing w:after="0" w:line="240" w:lineRule="auto"/>
+      </w:pPr>
+      <w:r>
+        <w:rPr>
+          <w:rFonts w:ascii="Courier New" w:hAnsi="Courier New"/>
+          <w:sz w:val="18"/>
+        </w:rPr>
+        <w:t>CREATE INDEX results_driver_IDX ON results (driver_ID);</w:t>
+      </w:r>
+    </w:p>
+    <w:p>
+      <w:pPr>
+        <w:spacing w:after="0" w:line="240" w:lineRule="auto"/>
+      </w:pPr>
+      <w:r>
+        <w:rPr>
+          <w:rFonts w:ascii="Courier New" w:hAnsi="Courier New"/>
+          <w:sz w:val="18"/>
+        </w:rPr>
+        <w:t>CREATE INDEX results_car_IDX ON results (car_ID);</w:t>
       </w:r>
     </w:p>
     <w:p>
@@ -5728,6 +6884,60 @@
     <w:p>
       <w:pPr>
         <w:keepNext/>
+        <w:jc w:val="center"/>
+      </w:pPr>
+      <w:r>
+        <w:drawing>
+          <wp:inline xmlns:a="http://schemas.openxmlformats.org/drawingml/2006/main" xmlns:pic="http://schemas.openxmlformats.org/drawingml/2006/picture">
+            <wp:extent cx="5940000" cy="3341250"/>
+            <wp:docPr id="6" name="Picture 6"/>
+            <wp:cNvGraphicFramePr>
+              <a:graphicFrameLocks noChangeAspect="1"/>
+            </wp:cNvGraphicFramePr>
+            <a:graphic>
+              <a:graphicData uri="http://schemas.openxmlformats.org/drawingml/2006/picture">
+                <pic:pic>
+                  <pic:nvPicPr>
+                    <pic:cNvPr id="0" name="08_results.png"/>
+                    <pic:cNvPicPr/>
+                  </pic:nvPicPr>
+                  <pic:blipFill>
+                    <a:blip r:embed="rId14"/>
+                    <a:stretch>
+                      <a:fillRect/>
+                    </a:stretch>
+                  </pic:blipFill>
+                  <pic:spPr>
+                    <a:xfrm>
+                      <a:off x="0" y="0"/>
+                      <a:ext cx="5940000" cy="3341250"/>
+                    </a:xfrm>
+                    <a:prstGeom prst="rect"/>
+                  </pic:spPr>
+                </pic:pic>
+              </a:graphicData>
+            </a:graphic>
+          </wp:inline>
+        </w:drawing>
+      </w:r>
+    </w:p>
+    <w:p>
+      <w:pPr>
+        <w:spacing w:after="120" w:line="240" w:lineRule="auto"/>
+        <w:ind w:firstLine="0"/>
+        <w:jc w:val="center"/>
+      </w:pPr>
+      <w:r>
+        <w:rPr>
+          <w:b w:val="0"/>
+          <w:sz w:val="24"/>
+        </w:rPr>
+        <w:t>Рисунок 6 — Таблица results: составной первичный ключ, три внешних ключа, UNIQUE, CHECK и индексы</w:t>
+      </w:r>
+    </w:p>
+    <w:p>
+      <w:pPr>
+        <w:keepNext/>
         <w:spacing w:after="120" w:line="360" w:lineRule="auto"/>
         <w:ind w:firstLine="0"/>
       </w:pPr>
@@ -5749,7 +6959,7 @@
           <w:b w:val="0"/>
           <w:sz w:val="28"/>
         </w:rPr>
-        <w:t>Скрипт 03_check.sql выводит из системного каталога список таблиц, полей, ограничений и индексов, а затем внутри транзакции вставляет тестовые данные и пытается нарушить каждое ограничение. В конце выполняется ROLLBACK, поэтому база остаётся пустой. Результаты приведены в таблице 11 и на рисунке 6, полный вывод — в файле check_output.txt.</w:t>
+        <w:t>Скрипт 03_check.sql выводит из системного каталога список таблиц, полей, ограничений и индексов, а затем внутри транзакции вставляет тестовые данные и пытается нарушить каждое ограничение. В конце выполняется ROLLBACK, поэтому база остаётся пустой. Результаты приведены в таблице 12 и на рисунке 7, полный вывод — в файле check_output.txt.</w:t>
       </w:r>
     </w:p>
     <w:p>
@@ -5762,7 +6972,7 @@
           <w:b w:val="0"/>
           <w:sz w:val="24"/>
         </w:rPr>
-        <w:t>Таблица 11 — Проверка ограничений</w:t>
+        <w:t>Таблица 12 — Проверка ограничений</w:t>
       </w:r>
     </w:p>
     <w:tbl>
@@ -6089,6 +7299,126 @@
               <w:rPr>
                 <w:sz w:val="22"/>
               </w:rPr>
+              <w:t>Результат несуществующего пилота</w:t>
+            </w:r>
+          </w:p>
+        </w:tc>
+        <w:tc>
+          <w:tcPr>
+            <w:tcW w:type="dxa" w:w="4819"/>
+          </w:tcPr>
+          <w:p>
+            <w:r/>
+            <w:r>
+              <w:rPr>
+                <w:sz w:val="22"/>
+              </w:rPr>
+              <w:t>foreign_key_violation (results_FK2)</w:t>
+            </w:r>
+          </w:p>
+        </w:tc>
+      </w:tr>
+      <w:tr>
+        <w:tc>
+          <w:tcPr>
+            <w:tcW w:type="dxa" w:w="4535"/>
+          </w:tcPr>
+          <w:p>
+            <w:r/>
+            <w:r>
+              <w:rPr>
+                <w:sz w:val="22"/>
+              </w:rPr>
+              <w:t>Второй пилот на том же месте гонки</w:t>
+            </w:r>
+          </w:p>
+        </w:tc>
+        <w:tc>
+          <w:tcPr>
+            <w:tcW w:type="dxa" w:w="4819"/>
+          </w:tcPr>
+          <w:p>
+            <w:r/>
+            <w:r>
+              <w:rPr>
+                <w:sz w:val="22"/>
+              </w:rPr>
+              <w:t>unique_violation (results_position_UQ)</w:t>
+            </w:r>
+          </w:p>
+        </w:tc>
+      </w:tr>
+      <w:tr>
+        <w:tc>
+          <w:tcPr>
+            <w:tcW w:type="dxa" w:w="4535"/>
+          </w:tcPr>
+          <w:p>
+            <w:r/>
+            <w:r>
+              <w:rPr>
+                <w:sz w:val="22"/>
+              </w:rPr>
+              <w:t>Второй результат пилота в одной гонке</w:t>
+            </w:r>
+          </w:p>
+        </w:tc>
+        <w:tc>
+          <w:tcPr>
+            <w:tcW w:type="dxa" w:w="4819"/>
+          </w:tcPr>
+          <w:p>
+            <w:r/>
+            <w:r>
+              <w:rPr>
+                <w:sz w:val="22"/>
+              </w:rPr>
+              <w:t>unique_violation (results_PK)</w:t>
+            </w:r>
+          </w:p>
+        </w:tc>
+      </w:tr>
+      <w:tr>
+        <w:tc>
+          <w:tcPr>
+            <w:tcW w:type="dxa" w:w="4535"/>
+          </w:tcPr>
+          <w:p>
+            <w:r/>
+            <w:r>
+              <w:rPr>
+                <w:sz w:val="22"/>
+              </w:rPr>
+              <w:t>Отрицательные очки</w:t>
+            </w:r>
+          </w:p>
+        </w:tc>
+        <w:tc>
+          <w:tcPr>
+            <w:tcW w:type="dxa" w:w="4819"/>
+          </w:tcPr>
+          <w:p>
+            <w:r/>
+            <w:r>
+              <w:rPr>
+                <w:sz w:val="22"/>
+              </w:rPr>
+              <w:t>check_violation (results_points_CHK)</w:t>
+            </w:r>
+          </w:p>
+        </w:tc>
+      </w:tr>
+      <w:tr>
+        <w:tc>
+          <w:tcPr>
+            <w:tcW w:type="dxa" w:w="4535"/>
+          </w:tcPr>
+          <w:p>
+            <w:r/>
+            <w:r>
+              <w:rPr>
+                <w:sz w:val="22"/>
+              </w:rPr>
               <w:t>Удаление трассы, на которой есть гонки</w:t>
             </w:r>
           </w:p>
@@ -6193,94 +7523,13 @@
               <w:rPr>
                 <w:sz w:val="22"/>
               </w:rPr>
-              <w:t>удалены её болид, пилот и привязки запчастей к болиду; справочник parts не изменился (ON DELETE CASCADE)</w:t>
+              <w:t>удалены её болид, пилот и привязки запчастей к болиду и результат её пилота; справочник parts не изменился (ON DELETE CASCADE)</w:t>
             </w:r>
           </w:p>
         </w:tc>
       </w:tr>
     </w:tbl>
     <w:p/>
-    <w:p>
-      <w:pPr>
-        <w:keepNext/>
-        <w:jc w:val="center"/>
-      </w:pPr>
-      <w:r>
-        <w:drawing>
-          <wp:inline xmlns:a="http://schemas.openxmlformats.org/drawingml/2006/main" xmlns:pic="http://schemas.openxmlformats.org/drawingml/2006/picture">
-            <wp:extent cx="5940000" cy="3341250"/>
-            <wp:docPr id="6" name="Picture 6"/>
-            <wp:cNvGraphicFramePr>
-              <a:graphicFrameLocks noChangeAspect="1"/>
-            </wp:cNvGraphicFramePr>
-            <a:graphic>
-              <a:graphicData uri="http://schemas.openxmlformats.org/drawingml/2006/picture">
-                <pic:pic>
-                  <pic:nvPicPr>
-                    <pic:cNvPr id="0" name="05_check_messages.png"/>
-                    <pic:cNvPicPr/>
-                  </pic:nvPicPr>
-                  <pic:blipFill>
-                    <a:blip r:embed="rId14"/>
-                    <a:stretch>
-                      <a:fillRect/>
-                    </a:stretch>
-                  </pic:blipFill>
-                  <pic:spPr>
-                    <a:xfrm>
-                      <a:off x="0" y="0"/>
-                      <a:ext cx="5940000" cy="3341250"/>
-                    </a:xfrm>
-                    <a:prstGeom prst="rect"/>
-                  </pic:spPr>
-                </pic:pic>
-              </a:graphicData>
-            </a:graphic>
-          </wp:inline>
-        </w:drawing>
-      </w:r>
-    </w:p>
-    <w:p>
-      <w:pPr>
-        <w:spacing w:after="120" w:line="240" w:lineRule="auto"/>
-        <w:ind w:firstLine="0"/>
-        <w:jc w:val="center"/>
-      </w:pPr>
-      <w:r>
-        <w:rPr>
-          <w:b w:val="0"/>
-          <w:sz w:val="24"/>
-        </w:rPr>
-        <w:t>Рисунок 6 — Результат выполнения 03_check.sql (вкладка Messages)</w:t>
-      </w:r>
-    </w:p>
-    <w:p>
-      <w:pPr>
-        <w:keepNext/>
-        <w:spacing w:after="120" w:line="360" w:lineRule="auto"/>
-        <w:ind w:firstLine="0"/>
-      </w:pPr>
-      <w:r>
-        <w:rPr>
-          <w:b/>
-          <w:sz w:val="28"/>
-        </w:rPr>
-        <w:t>6. ER-диаграмма</w:t>
-      </w:r>
-    </w:p>
-    <w:p>
-      <w:pPr>
-        <w:spacing w:after="0" w:line="360" w:lineRule="auto"/>
-        <w:ind w:firstLine="709"/>
-      </w:pPr>
-      <w:r>
-        <w:rPr>
-          <w:b w:val="0"/>
-          <w:sz w:val="28"/>
-        </w:rPr>
-        <w:t>ER-диаграмма построена в pgAdmin командой Tools &gt; ERD Tool, пункт ERD for Database (пособие, с. 80). На ней восемь таблиц и шесть связей «один-ко-многим», две из которых образуют связь «многие-ко-многим» болидов и запчастей.</w:t>
-      </w:r>
-    </w:p>
     <w:p>
       <w:pPr>
         <w:keepNext/>
@@ -6298,7 +7547,7 @@
               <a:graphicData uri="http://schemas.openxmlformats.org/drawingml/2006/picture">
                 <pic:pic>
                   <pic:nvPicPr>
-                    <pic:cNvPr id="0" name="06_erd.png"/>
+                    <pic:cNvPr id="0" name="05_check_messages.png"/>
                     <pic:cNvPicPr/>
                   </pic:nvPicPr>
                   <pic:blipFill>
@@ -6332,7 +7581,88 @@
           <w:b w:val="0"/>
           <w:sz w:val="24"/>
         </w:rPr>
-        <w:t>Рисунок 7 — ER-диаграмма базы данных formula1 (ERD Tool → ERD for Database)</w:t>
+        <w:t>Рисунок 7 — Результат выполнения 03_check.sql (вкладка Messages)</w:t>
+      </w:r>
+    </w:p>
+    <w:p>
+      <w:pPr>
+        <w:keepNext/>
+        <w:spacing w:after="120" w:line="360" w:lineRule="auto"/>
+        <w:ind w:firstLine="0"/>
+      </w:pPr>
+      <w:r>
+        <w:rPr>
+          <w:b/>
+          <w:sz w:val="28"/>
+        </w:rPr>
+        <w:t>6. ER-диаграмма</w:t>
+      </w:r>
+    </w:p>
+    <w:p>
+      <w:pPr>
+        <w:spacing w:after="0" w:line="360" w:lineRule="auto"/>
+        <w:ind w:firstLine="709"/>
+      </w:pPr>
+      <w:r>
+        <w:rPr>
+          <w:b w:val="0"/>
+          <w:sz w:val="28"/>
+        </w:rPr>
+        <w:t>ER-диаграмма построена в pgAdmin командой Tools &gt; ERD Tool, пункт ERD for Database (пособие, с. 80). На ней девять таблиц и девять связей «один-ко-многим»; две из них образуют связь «многие-ко-многим» болидов и запчастей, а таблица results соединяет гонки с пилотами и болидами.</w:t>
+      </w:r>
+    </w:p>
+    <w:p>
+      <w:pPr>
+        <w:keepNext/>
+        <w:jc w:val="center"/>
+      </w:pPr>
+      <w:r>
+        <w:drawing>
+          <wp:inline xmlns:a="http://schemas.openxmlformats.org/drawingml/2006/main" xmlns:pic="http://schemas.openxmlformats.org/drawingml/2006/picture">
+            <wp:extent cx="5940000" cy="3341250"/>
+            <wp:docPr id="8" name="Picture 8"/>
+            <wp:cNvGraphicFramePr>
+              <a:graphicFrameLocks noChangeAspect="1"/>
+            </wp:cNvGraphicFramePr>
+            <a:graphic>
+              <a:graphicData uri="http://schemas.openxmlformats.org/drawingml/2006/picture">
+                <pic:pic>
+                  <pic:nvPicPr>
+                    <pic:cNvPr id="0" name="06_erd.png"/>
+                    <pic:cNvPicPr/>
+                  </pic:nvPicPr>
+                  <pic:blipFill>
+                    <a:blip r:embed="rId16"/>
+                    <a:stretch>
+                      <a:fillRect/>
+                    </a:stretch>
+                  </pic:blipFill>
+                  <pic:spPr>
+                    <a:xfrm>
+                      <a:off x="0" y="0"/>
+                      <a:ext cx="5940000" cy="3341250"/>
+                    </a:xfrm>
+                    <a:prstGeom prst="rect"/>
+                  </pic:spPr>
+                </pic:pic>
+              </a:graphicData>
+            </a:graphic>
+          </wp:inline>
+        </w:drawing>
+      </w:r>
+    </w:p>
+    <w:p>
+      <w:pPr>
+        <w:spacing w:after="120" w:line="240" w:lineRule="auto"/>
+        <w:ind w:firstLine="0"/>
+        <w:jc w:val="center"/>
+      </w:pPr>
+      <w:r>
+        <w:rPr>
+          <w:b w:val="0"/>
+          <w:sz w:val="24"/>
+        </w:rPr>
+        <w:t>Рисунок 8 — ER-диаграмма базы данных formula1 (ERD Tool → ERD for Database)</w:t>
       </w:r>
     </w:p>
     <w:p>
@@ -6359,7 +7689,7 @@
           <w:b w:val="0"/>
           <w:sz w:val="28"/>
         </w:rPr>
-        <w:t>В ходе работы в PostgreSQL 15 создана база данных formula1 из восьми таблиц. Определены типы полей, первичные ключи (в том числе составной ключ связующей таблицы car_parts), шесть внешних ключей с действиями ON DELETE и ON UPDATE, ограничения NOT NULL, UNIQUE и CHECK, а также индексы на столбцы внешних ключей. Проверка на тестовых данных показала, что все ограничения отклоняют некорректные данные, а каскадные действия работают согласно модели предметной области.</w:t>
+        <w:t>В ходе работы в PostgreSQL 15 создана база данных formula1 из девяти таблиц. Определены типы полей, первичные ключи (в том числе составные ключи таблиц car_parts и results), девять внешних ключей с действиями ON DELETE и ON UPDATE, ограничения NOT NULL, UNIQUE и CHECK, а также индексы на столбцы внешних ключей. Проверка на тестовых данных показала, что все ограничения отклоняют некорректные данные, а каскадные действия работают согласно модели предметной области.</w:t>
       </w:r>
     </w:p>
     <w:sectPr>

</xml_diff>